<commit_message>
JCPA micro-fix: neutral wording + readable tables
</commit_message>
<xml_diff>
--- a/appendix_jcpa.docx
+++ b/appendix_jcpa.docx
@@ -21,6 +21,7 @@
     <w:tbl>
       <w:tblPr>
         <w:tblW w:type="auto" w:w="0"/>
+        <w:tblLayout w:type="fixed"/>
         <w:tblLook w:firstColumn="1" w:firstRow="1" w:lastColumn="0" w:lastRow="0" w:noHBand="0" w:noVBand="1" w:val="04A0"/>
         <w:tblBorders>
           <w:top w:val="single" w:sz="8"/>
@@ -46,7 +47,14 @@
             </w:tcBorders>
           </w:tcPr>
           <w:p>
+            <w:pPr>
+              <w:spacing w:line="240" w:lineRule="auto" w:after="40"/>
+            </w:pPr>
             <w:r>
+              <w:rPr>
+                <w:rFonts w:ascii="Times New Roman" w:hAnsi="Times New Roman"/>
+                <w:sz w:val="18"/>
+              </w:rPr>
               <w:t>Prefecture</w:t>
             </w:r>
           </w:p>
@@ -59,7 +67,14 @@
             </w:tcBorders>
           </w:tcPr>
           <w:p>
+            <w:pPr>
+              <w:spacing w:line="240" w:lineRule="auto" w:after="40"/>
+            </w:pPr>
             <w:r>
+              <w:rPr>
+                <w:rFonts w:ascii="Times New Roman" w:hAnsi="Times New Roman"/>
+                <w:sz w:val="18"/>
+              </w:rPr>
               <w:t>Municipality</w:t>
             </w:r>
           </w:p>
@@ -72,7 +87,14 @@
             </w:tcBorders>
           </w:tcPr>
           <w:p>
+            <w:pPr>
+              <w:spacing w:line="240" w:lineRule="auto" w:after="40"/>
+            </w:pPr>
             <w:r>
+              <w:rPr>
+                <w:rFonts w:ascii="Times New Roman" w:hAnsi="Times New Roman"/>
+                <w:sz w:val="18"/>
+              </w:rPr>
               <w:t>Reason</w:t>
             </w:r>
           </w:p>
@@ -85,7 +107,14 @@
             </w:tcBorders>
           </w:tcPr>
           <w:p>
+            <w:pPr>
+              <w:spacing w:line="240" w:lineRule="auto" w:after="40"/>
+            </w:pPr>
             <w:r>
+              <w:rPr>
+                <w:rFonts w:ascii="Times New Roman" w:hAnsi="Times New Roman"/>
+                <w:sz w:val="18"/>
+              </w:rPr>
               <w:t>Years missing</w:t>
             </w:r>
           </w:p>
@@ -97,7 +126,14 @@
             <w:tcW w:type="dxa" w:w="2412"/>
           </w:tcPr>
           <w:p>
+            <w:pPr>
+              <w:spacing w:line="240" w:lineRule="auto" w:after="40"/>
+            </w:pPr>
             <w:r>
+              <w:rPr>
+                <w:rFonts w:ascii="Times New Roman" w:hAnsi="Times New Roman"/>
+                <w:sz w:val="18"/>
+              </w:rPr>
               <w:t>Iwate</w:t>
             </w:r>
           </w:p>
@@ -107,7 +143,14 @@
             <w:tcW w:type="dxa" w:w="2412"/>
           </w:tcPr>
           <w:p>
+            <w:pPr>
+              <w:spacing w:line="240" w:lineRule="auto" w:after="40"/>
+            </w:pPr>
             <w:r>
+              <w:rPr>
+                <w:rFonts w:ascii="Times New Roman" w:hAnsi="Times New Roman"/>
+                <w:sz w:val="18"/>
+              </w:rPr>
               <w:t>Hachimantai</w:t>
             </w:r>
           </w:p>
@@ -117,7 +160,14 @@
             <w:tcW w:type="dxa" w:w="2412"/>
           </w:tcPr>
           <w:p>
+            <w:pPr>
+              <w:spacing w:line="240" w:lineRule="auto" w:after="40"/>
+            </w:pPr>
             <w:r>
+              <w:rPr>
+                <w:rFonts w:ascii="Times New Roman" w:hAnsi="Times New Roman"/>
+                <w:sz w:val="18"/>
+              </w:rPr>
               <w:t>Population missing in at least one year 2005-2019</w:t>
             </w:r>
           </w:p>
@@ -127,7 +177,14 @@
             <w:tcW w:type="dxa" w:w="2412"/>
           </w:tcPr>
           <w:p>
+            <w:pPr>
+              <w:spacing w:line="240" w:lineRule="auto" w:after="40"/>
+            </w:pPr>
             <w:r>
+              <w:rPr>
+                <w:rFonts w:ascii="Times New Roman" w:hAnsi="Times New Roman"/>
+                <w:sz w:val="18"/>
+              </w:rPr>
               <w:t>2005</w:t>
             </w:r>
           </w:p>
@@ -139,7 +196,14 @@
             <w:tcW w:type="dxa" w:w="2412"/>
           </w:tcPr>
           <w:p>
+            <w:pPr>
+              <w:spacing w:line="240" w:lineRule="auto" w:after="40"/>
+            </w:pPr>
             <w:r>
+              <w:rPr>
+                <w:rFonts w:ascii="Times New Roman" w:hAnsi="Times New Roman"/>
+                <w:sz w:val="18"/>
+              </w:rPr>
               <w:t>Iwate</w:t>
             </w:r>
           </w:p>
@@ -149,7 +213,14 @@
             <w:tcW w:type="dxa" w:w="2412"/>
           </w:tcPr>
           <w:p>
+            <w:pPr>
+              <w:spacing w:line="240" w:lineRule="auto" w:after="40"/>
+            </w:pPr>
             <w:r>
+              <w:rPr>
+                <w:rFonts w:ascii="Times New Roman" w:hAnsi="Times New Roman"/>
+                <w:sz w:val="18"/>
+              </w:rPr>
               <w:t>Oshu</w:t>
             </w:r>
           </w:p>
@@ -159,7 +230,14 @@
             <w:tcW w:type="dxa" w:w="2412"/>
           </w:tcPr>
           <w:p>
+            <w:pPr>
+              <w:spacing w:line="240" w:lineRule="auto" w:after="40"/>
+            </w:pPr>
             <w:r>
+              <w:rPr>
+                <w:rFonts w:ascii="Times New Roman" w:hAnsi="Times New Roman"/>
+                <w:sz w:val="18"/>
+              </w:rPr>
               <w:t>Unit not observed under a single code 2005-2019</w:t>
             </w:r>
           </w:p>
@@ -169,7 +247,14 @@
             <w:tcW w:type="dxa" w:w="2412"/>
           </w:tcPr>
           <w:p>
+            <w:pPr>
+              <w:spacing w:line="240" w:lineRule="auto" w:after="40"/>
+            </w:pPr>
             <w:r>
+              <w:rPr>
+                <w:rFonts w:ascii="Times New Roman" w:hAnsi="Times New Roman"/>
+                <w:sz w:val="18"/>
+              </w:rPr>
               <w:t>2005</w:t>
             </w:r>
           </w:p>
@@ -181,7 +266,14 @@
             <w:tcW w:type="dxa" w:w="2412"/>
           </w:tcPr>
           <w:p>
+            <w:pPr>
+              <w:spacing w:line="240" w:lineRule="auto" w:after="40"/>
+            </w:pPr>
             <w:r>
+              <w:rPr>
+                <w:rFonts w:ascii="Times New Roman" w:hAnsi="Times New Roman"/>
+                <w:sz w:val="18"/>
+              </w:rPr>
               <w:t>Iwate</w:t>
             </w:r>
           </w:p>
@@ -191,7 +283,14 @@
             <w:tcW w:type="dxa" w:w="2412"/>
           </w:tcPr>
           <w:p>
+            <w:pPr>
+              <w:spacing w:line="240" w:lineRule="auto" w:after="40"/>
+            </w:pPr>
             <w:r>
+              <w:rPr>
+                <w:rFonts w:ascii="Times New Roman" w:hAnsi="Times New Roman"/>
+                <w:sz w:val="18"/>
+              </w:rPr>
               <w:t>Takizawa</w:t>
             </w:r>
           </w:p>
@@ -201,7 +300,14 @@
             <w:tcW w:type="dxa" w:w="2412"/>
           </w:tcPr>
           <w:p>
+            <w:pPr>
+              <w:spacing w:line="240" w:lineRule="auto" w:after="40"/>
+            </w:pPr>
             <w:r>
+              <w:rPr>
+                <w:rFonts w:ascii="Times New Roman" w:hAnsi="Times New Roman"/>
+                <w:sz w:val="18"/>
+              </w:rPr>
               <w:t>Unit not observed under a single code 2005-2019</w:t>
             </w:r>
           </w:p>
@@ -211,7 +317,14 @@
             <w:tcW w:type="dxa" w:w="2412"/>
           </w:tcPr>
           <w:p>
+            <w:pPr>
+              <w:spacing w:line="240" w:lineRule="auto" w:after="40"/>
+            </w:pPr>
             <w:r>
+              <w:rPr>
+                <w:rFonts w:ascii="Times New Roman" w:hAnsi="Times New Roman"/>
+                <w:sz w:val="18"/>
+              </w:rPr>
               <w:t>2005,2006,2007,2008,2009,2010,2011,2012,2013</w:t>
             </w:r>
           </w:p>
@@ -223,7 +336,14 @@
             <w:tcW w:type="dxa" w:w="2412"/>
           </w:tcPr>
           <w:p>
+            <w:pPr>
+              <w:spacing w:line="240" w:lineRule="auto" w:after="40"/>
+            </w:pPr>
             <w:r>
+              <w:rPr>
+                <w:rFonts w:ascii="Times New Roman" w:hAnsi="Times New Roman"/>
+                <w:sz w:val="18"/>
+              </w:rPr>
               <w:t>Iwate</w:t>
             </w:r>
           </w:p>
@@ -233,7 +353,14 @@
             <w:tcW w:type="dxa" w:w="2412"/>
           </w:tcPr>
           <w:p>
+            <w:pPr>
+              <w:spacing w:line="240" w:lineRule="auto" w:after="40"/>
+            </w:pPr>
             <w:r>
+              <w:rPr>
+                <w:rFonts w:ascii="Times New Roman" w:hAnsi="Times New Roman"/>
+                <w:sz w:val="18"/>
+              </w:rPr>
               <w:t>Nishiwaga</w:t>
             </w:r>
           </w:p>
@@ -243,7 +370,14 @@
             <w:tcW w:type="dxa" w:w="2412"/>
           </w:tcPr>
           <w:p>
+            <w:pPr>
+              <w:spacing w:line="240" w:lineRule="auto" w:after="40"/>
+            </w:pPr>
             <w:r>
+              <w:rPr>
+                <w:rFonts w:ascii="Times New Roman" w:hAnsi="Times New Roman"/>
+                <w:sz w:val="18"/>
+              </w:rPr>
               <w:t>Population missing in at least one year 2005-2019</w:t>
             </w:r>
           </w:p>
@@ -253,7 +387,14 @@
             <w:tcW w:type="dxa" w:w="2412"/>
           </w:tcPr>
           <w:p>
+            <w:pPr>
+              <w:spacing w:line="240" w:lineRule="auto" w:after="40"/>
+            </w:pPr>
             <w:r>
+              <w:rPr>
+                <w:rFonts w:ascii="Times New Roman" w:hAnsi="Times New Roman"/>
+                <w:sz w:val="18"/>
+              </w:rPr>
               <w:t>2005</w:t>
             </w:r>
           </w:p>
@@ -265,7 +406,14 @@
             <w:tcW w:type="dxa" w:w="2412"/>
           </w:tcPr>
           <w:p>
+            <w:pPr>
+              <w:spacing w:line="240" w:lineRule="auto" w:after="40"/>
+            </w:pPr>
             <w:r>
+              <w:rPr>
+                <w:rFonts w:ascii="Times New Roman" w:hAnsi="Times New Roman"/>
+                <w:sz w:val="18"/>
+              </w:rPr>
               <w:t>Iwate</w:t>
             </w:r>
           </w:p>
@@ -275,7 +423,14 @@
             <w:tcW w:type="dxa" w:w="2412"/>
           </w:tcPr>
           <w:p>
+            <w:pPr>
+              <w:spacing w:line="240" w:lineRule="auto" w:after="40"/>
+            </w:pPr>
             <w:r>
+              <w:rPr>
+                <w:rFonts w:ascii="Times New Roman" w:hAnsi="Times New Roman"/>
+                <w:sz w:val="18"/>
+              </w:rPr>
               <w:t>Hirono</w:t>
             </w:r>
           </w:p>
@@ -285,7 +440,14 @@
             <w:tcW w:type="dxa" w:w="2412"/>
           </w:tcPr>
           <w:p>
+            <w:pPr>
+              <w:spacing w:line="240" w:lineRule="auto" w:after="40"/>
+            </w:pPr>
             <w:r>
+              <w:rPr>
+                <w:rFonts w:ascii="Times New Roman" w:hAnsi="Times New Roman"/>
+                <w:sz w:val="18"/>
+              </w:rPr>
               <w:t>Unit not observed under a single code 2005-2019</w:t>
             </w:r>
           </w:p>
@@ -295,7 +457,14 @@
             <w:tcW w:type="dxa" w:w="2412"/>
           </w:tcPr>
           <w:p>
+            <w:pPr>
+              <w:spacing w:line="240" w:lineRule="auto" w:after="40"/>
+            </w:pPr>
             <w:r>
+              <w:rPr>
+                <w:rFonts w:ascii="Times New Roman" w:hAnsi="Times New Roman"/>
+                <w:sz w:val="18"/>
+              </w:rPr>
               <w:t>2005</w:t>
             </w:r>
           </w:p>
@@ -307,7 +476,14 @@
             <w:tcW w:type="dxa" w:w="2412"/>
           </w:tcPr>
           <w:p>
+            <w:pPr>
+              <w:spacing w:line="240" w:lineRule="auto" w:after="40"/>
+            </w:pPr>
             <w:r>
+              <w:rPr>
+                <w:rFonts w:ascii="Times New Roman" w:hAnsi="Times New Roman"/>
+                <w:sz w:val="18"/>
+              </w:rPr>
               <w:t>Miyagi</w:t>
             </w:r>
           </w:p>
@@ -317,7 +493,14 @@
             <w:tcW w:type="dxa" w:w="2412"/>
           </w:tcPr>
           <w:p>
+            <w:pPr>
+              <w:spacing w:line="240" w:lineRule="auto" w:after="40"/>
+            </w:pPr>
             <w:r>
+              <w:rPr>
+                <w:rFonts w:ascii="Times New Roman" w:hAnsi="Times New Roman"/>
+                <w:sz w:val="18"/>
+              </w:rPr>
               <w:t>Aoba Ward, Sendai</w:t>
             </w:r>
           </w:p>
@@ -327,7 +510,14 @@
             <w:tcW w:type="dxa" w:w="2412"/>
           </w:tcPr>
           <w:p>
+            <w:pPr>
+              <w:spacing w:line="240" w:lineRule="auto" w:after="40"/>
+            </w:pPr>
             <w:r>
+              <w:rPr>
+                <w:rFonts w:ascii="Times New Roman" w:hAnsi="Times New Roman"/>
+                <w:sz w:val="18"/>
+              </w:rPr>
               <w:t>Population missing in at least one year 2005-2019</w:t>
             </w:r>
           </w:p>
@@ -337,7 +527,14 @@
             <w:tcW w:type="dxa" w:w="2412"/>
           </w:tcPr>
           <w:p>
+            <w:pPr>
+              <w:spacing w:line="240" w:lineRule="auto" w:after="40"/>
+            </w:pPr>
             <w:r>
+              <w:rPr>
+                <w:rFonts w:ascii="Times New Roman" w:hAnsi="Times New Roman"/>
+                <w:sz w:val="18"/>
+              </w:rPr>
               <w:t>2006,2007,2008,2009,2010</w:t>
             </w:r>
           </w:p>
@@ -349,7 +546,14 @@
             <w:tcW w:type="dxa" w:w="2412"/>
           </w:tcPr>
           <w:p>
+            <w:pPr>
+              <w:spacing w:line="240" w:lineRule="auto" w:after="40"/>
+            </w:pPr>
             <w:r>
+              <w:rPr>
+                <w:rFonts w:ascii="Times New Roman" w:hAnsi="Times New Roman"/>
+                <w:sz w:val="18"/>
+              </w:rPr>
               <w:t>Miyagi</w:t>
             </w:r>
           </w:p>
@@ -359,7 +563,14 @@
             <w:tcW w:type="dxa" w:w="2412"/>
           </w:tcPr>
           <w:p>
+            <w:pPr>
+              <w:spacing w:line="240" w:lineRule="auto" w:after="40"/>
+            </w:pPr>
             <w:r>
+              <w:rPr>
+                <w:rFonts w:ascii="Times New Roman" w:hAnsi="Times New Roman"/>
+                <w:sz w:val="18"/>
+              </w:rPr>
               <w:t>Miyagino Ward, Sendai</w:t>
             </w:r>
           </w:p>
@@ -369,7 +580,14 @@
             <w:tcW w:type="dxa" w:w="2412"/>
           </w:tcPr>
           <w:p>
+            <w:pPr>
+              <w:spacing w:line="240" w:lineRule="auto" w:after="40"/>
+            </w:pPr>
             <w:r>
+              <w:rPr>
+                <w:rFonts w:ascii="Times New Roman" w:hAnsi="Times New Roman"/>
+                <w:sz w:val="18"/>
+              </w:rPr>
               <w:t>Population missing in at least one year 2005-2019</w:t>
             </w:r>
           </w:p>
@@ -379,7 +597,14 @@
             <w:tcW w:type="dxa" w:w="2412"/>
           </w:tcPr>
           <w:p>
+            <w:pPr>
+              <w:spacing w:line="240" w:lineRule="auto" w:after="40"/>
+            </w:pPr>
             <w:r>
+              <w:rPr>
+                <w:rFonts w:ascii="Times New Roman" w:hAnsi="Times New Roman"/>
+                <w:sz w:val="18"/>
+              </w:rPr>
               <w:t>2005,2006,2007,2008,2009,2010</w:t>
             </w:r>
           </w:p>
@@ -391,7 +616,14 @@
             <w:tcW w:type="dxa" w:w="2412"/>
           </w:tcPr>
           <w:p>
+            <w:pPr>
+              <w:spacing w:line="240" w:lineRule="auto" w:after="40"/>
+            </w:pPr>
             <w:r>
+              <w:rPr>
+                <w:rFonts w:ascii="Times New Roman" w:hAnsi="Times New Roman"/>
+                <w:sz w:val="18"/>
+              </w:rPr>
               <w:t>Miyagi</w:t>
             </w:r>
           </w:p>
@@ -401,7 +633,14 @@
             <w:tcW w:type="dxa" w:w="2412"/>
           </w:tcPr>
           <w:p>
+            <w:pPr>
+              <w:spacing w:line="240" w:lineRule="auto" w:after="40"/>
+            </w:pPr>
             <w:r>
+              <w:rPr>
+                <w:rFonts w:ascii="Times New Roman" w:hAnsi="Times New Roman"/>
+                <w:sz w:val="18"/>
+              </w:rPr>
               <w:t>Wakabayashi Ward, Sendai</w:t>
             </w:r>
           </w:p>
@@ -411,7 +650,14 @@
             <w:tcW w:type="dxa" w:w="2412"/>
           </w:tcPr>
           <w:p>
+            <w:pPr>
+              <w:spacing w:line="240" w:lineRule="auto" w:after="40"/>
+            </w:pPr>
             <w:r>
+              <w:rPr>
+                <w:rFonts w:ascii="Times New Roman" w:hAnsi="Times New Roman"/>
+                <w:sz w:val="18"/>
+              </w:rPr>
               <w:t>Population missing in at least one year 2005-2019</w:t>
             </w:r>
           </w:p>
@@ -421,7 +667,14 @@
             <w:tcW w:type="dxa" w:w="2412"/>
           </w:tcPr>
           <w:p>
+            <w:pPr>
+              <w:spacing w:line="240" w:lineRule="auto" w:after="40"/>
+            </w:pPr>
             <w:r>
+              <w:rPr>
+                <w:rFonts w:ascii="Times New Roman" w:hAnsi="Times New Roman"/>
+                <w:sz w:val="18"/>
+              </w:rPr>
               <w:t>2005,2006,2007,2008,2009,2010</w:t>
             </w:r>
           </w:p>
@@ -433,7 +686,14 @@
             <w:tcW w:type="dxa" w:w="2412"/>
           </w:tcPr>
           <w:p>
+            <w:pPr>
+              <w:spacing w:line="240" w:lineRule="auto" w:after="40"/>
+            </w:pPr>
             <w:r>
+              <w:rPr>
+                <w:rFonts w:ascii="Times New Roman" w:hAnsi="Times New Roman"/>
+                <w:sz w:val="18"/>
+              </w:rPr>
               <w:t>Miyagi</w:t>
             </w:r>
           </w:p>
@@ -443,7 +703,14 @@
             <w:tcW w:type="dxa" w:w="2412"/>
           </w:tcPr>
           <w:p>
+            <w:pPr>
+              <w:spacing w:line="240" w:lineRule="auto" w:after="40"/>
+            </w:pPr>
             <w:r>
+              <w:rPr>
+                <w:rFonts w:ascii="Times New Roman" w:hAnsi="Times New Roman"/>
+                <w:sz w:val="18"/>
+              </w:rPr>
               <w:t>Taihaku Ward, Sendai</w:t>
             </w:r>
           </w:p>
@@ -453,7 +720,14 @@
             <w:tcW w:type="dxa" w:w="2412"/>
           </w:tcPr>
           <w:p>
+            <w:pPr>
+              <w:spacing w:line="240" w:lineRule="auto" w:after="40"/>
+            </w:pPr>
             <w:r>
+              <w:rPr>
+                <w:rFonts w:ascii="Times New Roman" w:hAnsi="Times New Roman"/>
+                <w:sz w:val="18"/>
+              </w:rPr>
               <w:t>Population missing in at least one year 2005-2019</w:t>
             </w:r>
           </w:p>
@@ -463,7 +737,14 @@
             <w:tcW w:type="dxa" w:w="2412"/>
           </w:tcPr>
           <w:p>
+            <w:pPr>
+              <w:spacing w:line="240" w:lineRule="auto" w:after="40"/>
+            </w:pPr>
             <w:r>
+              <w:rPr>
+                <w:rFonts w:ascii="Times New Roman" w:hAnsi="Times New Roman"/>
+                <w:sz w:val="18"/>
+              </w:rPr>
               <w:t>2005,2006,2007,2008,2009,2010</w:t>
             </w:r>
           </w:p>
@@ -475,7 +756,14 @@
             <w:tcW w:type="dxa" w:w="2412"/>
           </w:tcPr>
           <w:p>
+            <w:pPr>
+              <w:spacing w:line="240" w:lineRule="auto" w:after="40"/>
+            </w:pPr>
             <w:r>
+              <w:rPr>
+                <w:rFonts w:ascii="Times New Roman" w:hAnsi="Times New Roman"/>
+                <w:sz w:val="18"/>
+              </w:rPr>
               <w:t>Miyagi</w:t>
             </w:r>
           </w:p>
@@ -485,7 +773,14 @@
             <w:tcW w:type="dxa" w:w="2412"/>
           </w:tcPr>
           <w:p>
+            <w:pPr>
+              <w:spacing w:line="240" w:lineRule="auto" w:after="40"/>
+            </w:pPr>
             <w:r>
+              <w:rPr>
+                <w:rFonts w:ascii="Times New Roman" w:hAnsi="Times New Roman"/>
+                <w:sz w:val="18"/>
+              </w:rPr>
               <w:t>Izumi Ward, Sendai</w:t>
             </w:r>
           </w:p>
@@ -495,7 +790,14 @@
             <w:tcW w:type="dxa" w:w="2412"/>
           </w:tcPr>
           <w:p>
+            <w:pPr>
+              <w:spacing w:line="240" w:lineRule="auto" w:after="40"/>
+            </w:pPr>
             <w:r>
+              <w:rPr>
+                <w:rFonts w:ascii="Times New Roman" w:hAnsi="Times New Roman"/>
+                <w:sz w:val="18"/>
+              </w:rPr>
               <w:t>Population missing in at least one year 2005-2019</w:t>
             </w:r>
           </w:p>
@@ -505,7 +807,14 @@
             <w:tcW w:type="dxa" w:w="2412"/>
           </w:tcPr>
           <w:p>
+            <w:pPr>
+              <w:spacing w:line="240" w:lineRule="auto" w:after="40"/>
+            </w:pPr>
             <w:r>
+              <w:rPr>
+                <w:rFonts w:ascii="Times New Roman" w:hAnsi="Times New Roman"/>
+                <w:sz w:val="18"/>
+              </w:rPr>
               <w:t>2005,2006,2007,2008,2009,2010</w:t>
             </w:r>
           </w:p>
@@ -517,7 +826,14 @@
             <w:tcW w:type="dxa" w:w="2412"/>
           </w:tcPr>
           <w:p>
+            <w:pPr>
+              <w:spacing w:line="240" w:lineRule="auto" w:after="40"/>
+            </w:pPr>
             <w:r>
+              <w:rPr>
+                <w:rFonts w:ascii="Times New Roman" w:hAnsi="Times New Roman"/>
+                <w:sz w:val="18"/>
+              </w:rPr>
               <w:t>Miyagi</w:t>
             </w:r>
           </w:p>
@@ -527,7 +843,14 @@
             <w:tcW w:type="dxa" w:w="2412"/>
           </w:tcPr>
           <w:p>
+            <w:pPr>
+              <w:spacing w:line="240" w:lineRule="auto" w:after="40"/>
+            </w:pPr>
             <w:r>
+              <w:rPr>
+                <w:rFonts w:ascii="Times New Roman" w:hAnsi="Times New Roman"/>
+                <w:sz w:val="18"/>
+              </w:rPr>
               <w:t>Shiogama</w:t>
             </w:r>
           </w:p>
@@ -537,7 +860,14 @@
             <w:tcW w:type="dxa" w:w="2412"/>
           </w:tcPr>
           <w:p>
+            <w:pPr>
+              <w:spacing w:line="240" w:lineRule="auto" w:after="40"/>
+            </w:pPr>
             <w:r>
+              <w:rPr>
+                <w:rFonts w:ascii="Times New Roman" w:hAnsi="Times New Roman"/>
+                <w:sz w:val="18"/>
+              </w:rPr>
               <w:t>Population missing in at least one year 2005-2019</w:t>
             </w:r>
           </w:p>
@@ -547,7 +877,14 @@
             <w:tcW w:type="dxa" w:w="2412"/>
           </w:tcPr>
           <w:p>
+            <w:pPr>
+              <w:spacing w:line="240" w:lineRule="auto" w:after="40"/>
+            </w:pPr>
             <w:r>
+              <w:rPr>
+                <w:rFonts w:ascii="Times New Roman" w:hAnsi="Times New Roman"/>
+                <w:sz w:val="18"/>
+              </w:rPr>
               <w:t>2006,2007</w:t>
             </w:r>
           </w:p>
@@ -559,7 +896,14 @@
             <w:tcW w:type="dxa" w:w="2412"/>
           </w:tcPr>
           <w:p>
+            <w:pPr>
+              <w:spacing w:line="240" w:lineRule="auto" w:after="40"/>
+            </w:pPr>
             <w:r>
+              <w:rPr>
+                <w:rFonts w:ascii="Times New Roman" w:hAnsi="Times New Roman"/>
+                <w:sz w:val="18"/>
+              </w:rPr>
               <w:t>Miyagi</w:t>
             </w:r>
           </w:p>
@@ -569,7 +913,14 @@
             <w:tcW w:type="dxa" w:w="2412"/>
           </w:tcPr>
           <w:p>
+            <w:pPr>
+              <w:spacing w:line="240" w:lineRule="auto" w:after="40"/>
+            </w:pPr>
             <w:r>
+              <w:rPr>
+                <w:rFonts w:ascii="Times New Roman" w:hAnsi="Times New Roman"/>
+                <w:sz w:val="18"/>
+              </w:rPr>
               <w:t>Tome</w:t>
             </w:r>
           </w:p>
@@ -579,7 +930,14 @@
             <w:tcW w:type="dxa" w:w="2412"/>
           </w:tcPr>
           <w:p>
+            <w:pPr>
+              <w:spacing w:line="240" w:lineRule="auto" w:after="40"/>
+            </w:pPr>
             <w:r>
+              <w:rPr>
+                <w:rFonts w:ascii="Times New Roman" w:hAnsi="Times New Roman"/>
+                <w:sz w:val="18"/>
+              </w:rPr>
               <w:t>Population missing in at least one year 2005-2019</w:t>
             </w:r>
           </w:p>
@@ -589,7 +947,14 @@
             <w:tcW w:type="dxa" w:w="2412"/>
           </w:tcPr>
           <w:p>
+            <w:pPr>
+              <w:spacing w:line="240" w:lineRule="auto" w:after="40"/>
+            </w:pPr>
             <w:r>
+              <w:rPr>
+                <w:rFonts w:ascii="Times New Roman" w:hAnsi="Times New Roman"/>
+                <w:sz w:val="18"/>
+              </w:rPr>
               <w:t>2005</w:t>
             </w:r>
           </w:p>
@@ -601,7 +966,14 @@
             <w:tcW w:type="dxa" w:w="2412"/>
           </w:tcPr>
           <w:p>
+            <w:pPr>
+              <w:spacing w:line="240" w:lineRule="auto" w:after="40"/>
+            </w:pPr>
             <w:r>
+              <w:rPr>
+                <w:rFonts w:ascii="Times New Roman" w:hAnsi="Times New Roman"/>
+                <w:sz w:val="18"/>
+              </w:rPr>
               <w:t>Miyagi</w:t>
             </w:r>
           </w:p>
@@ -611,7 +983,14 @@
             <w:tcW w:type="dxa" w:w="2412"/>
           </w:tcPr>
           <w:p>
+            <w:pPr>
+              <w:spacing w:line="240" w:lineRule="auto" w:after="40"/>
+            </w:pPr>
             <w:r>
+              <w:rPr>
+                <w:rFonts w:ascii="Times New Roman" w:hAnsi="Times New Roman"/>
+                <w:sz w:val="18"/>
+              </w:rPr>
               <w:t>Kurihara</w:t>
             </w:r>
           </w:p>
@@ -621,7 +1000,14 @@
             <w:tcW w:type="dxa" w:w="2412"/>
           </w:tcPr>
           <w:p>
+            <w:pPr>
+              <w:spacing w:line="240" w:lineRule="auto" w:after="40"/>
+            </w:pPr>
             <w:r>
+              <w:rPr>
+                <w:rFonts w:ascii="Times New Roman" w:hAnsi="Times New Roman"/>
+                <w:sz w:val="18"/>
+              </w:rPr>
               <w:t>Population missing in at least one year 2005-2019</w:t>
             </w:r>
           </w:p>
@@ -631,7 +1017,14 @@
             <w:tcW w:type="dxa" w:w="2412"/>
           </w:tcPr>
           <w:p>
+            <w:pPr>
+              <w:spacing w:line="240" w:lineRule="auto" w:after="40"/>
+            </w:pPr>
             <w:r>
+              <w:rPr>
+                <w:rFonts w:ascii="Times New Roman" w:hAnsi="Times New Roman"/>
+                <w:sz w:val="18"/>
+              </w:rPr>
               <w:t>2005</w:t>
             </w:r>
           </w:p>
@@ -643,7 +1036,14 @@
             <w:tcW w:type="dxa" w:w="2412"/>
           </w:tcPr>
           <w:p>
+            <w:pPr>
+              <w:spacing w:line="240" w:lineRule="auto" w:after="40"/>
+            </w:pPr>
             <w:r>
+              <w:rPr>
+                <w:rFonts w:ascii="Times New Roman" w:hAnsi="Times New Roman"/>
+                <w:sz w:val="18"/>
+              </w:rPr>
               <w:t>Miyagi</w:t>
             </w:r>
           </w:p>
@@ -653,7 +1053,14 @@
             <w:tcW w:type="dxa" w:w="2412"/>
           </w:tcPr>
           <w:p>
+            <w:pPr>
+              <w:spacing w:line="240" w:lineRule="auto" w:after="40"/>
+            </w:pPr>
             <w:r>
+              <w:rPr>
+                <w:rFonts w:ascii="Times New Roman" w:hAnsi="Times New Roman"/>
+                <w:sz w:val="18"/>
+              </w:rPr>
               <w:t>Higashimatsushima</w:t>
             </w:r>
           </w:p>
@@ -663,7 +1070,14 @@
             <w:tcW w:type="dxa" w:w="2412"/>
           </w:tcPr>
           <w:p>
+            <w:pPr>
+              <w:spacing w:line="240" w:lineRule="auto" w:after="40"/>
+            </w:pPr>
             <w:r>
+              <w:rPr>
+                <w:rFonts w:ascii="Times New Roman" w:hAnsi="Times New Roman"/>
+                <w:sz w:val="18"/>
+              </w:rPr>
               <w:t>Population missing in at least one year 2005-2019</w:t>
             </w:r>
           </w:p>
@@ -673,7 +1087,14 @@
             <w:tcW w:type="dxa" w:w="2412"/>
           </w:tcPr>
           <w:p>
+            <w:pPr>
+              <w:spacing w:line="240" w:lineRule="auto" w:after="40"/>
+            </w:pPr>
             <w:r>
+              <w:rPr>
+                <w:rFonts w:ascii="Times New Roman" w:hAnsi="Times New Roman"/>
+                <w:sz w:val="18"/>
+              </w:rPr>
               <w:t>2005</w:t>
             </w:r>
           </w:p>
@@ -685,7 +1106,14 @@
             <w:tcW w:type="dxa" w:w="2412"/>
           </w:tcPr>
           <w:p>
+            <w:pPr>
+              <w:spacing w:line="240" w:lineRule="auto" w:after="40"/>
+            </w:pPr>
             <w:r>
+              <w:rPr>
+                <w:rFonts w:ascii="Times New Roman" w:hAnsi="Times New Roman"/>
+                <w:sz w:val="18"/>
+              </w:rPr>
               <w:t>Miyagi</w:t>
             </w:r>
           </w:p>
@@ -695,7 +1123,14 @@
             <w:tcW w:type="dxa" w:w="2412"/>
           </w:tcPr>
           <w:p>
+            <w:pPr>
+              <w:spacing w:line="240" w:lineRule="auto" w:after="40"/>
+            </w:pPr>
             <w:r>
+              <w:rPr>
+                <w:rFonts w:ascii="Times New Roman" w:hAnsi="Times New Roman"/>
+                <w:sz w:val="18"/>
+              </w:rPr>
               <w:t>Osaki</w:t>
             </w:r>
           </w:p>
@@ -705,7 +1140,14 @@
             <w:tcW w:type="dxa" w:w="2412"/>
           </w:tcPr>
           <w:p>
+            <w:pPr>
+              <w:spacing w:line="240" w:lineRule="auto" w:after="40"/>
+            </w:pPr>
             <w:r>
+              <w:rPr>
+                <w:rFonts w:ascii="Times New Roman" w:hAnsi="Times New Roman"/>
+                <w:sz w:val="18"/>
+              </w:rPr>
               <w:t>Unit not observed under a single code 2005-2019</w:t>
             </w:r>
           </w:p>
@@ -715,7 +1157,14 @@
             <w:tcW w:type="dxa" w:w="2412"/>
           </w:tcPr>
           <w:p>
+            <w:pPr>
+              <w:spacing w:line="240" w:lineRule="auto" w:after="40"/>
+            </w:pPr>
             <w:r>
+              <w:rPr>
+                <w:rFonts w:ascii="Times New Roman" w:hAnsi="Times New Roman"/>
+                <w:sz w:val="18"/>
+              </w:rPr>
               <w:t>2005</w:t>
             </w:r>
           </w:p>
@@ -727,7 +1176,14 @@
             <w:tcW w:type="dxa" w:w="2412"/>
           </w:tcPr>
           <w:p>
+            <w:pPr>
+              <w:spacing w:line="240" w:lineRule="auto" w:after="40"/>
+            </w:pPr>
             <w:r>
+              <w:rPr>
+                <w:rFonts w:ascii="Times New Roman" w:hAnsi="Times New Roman"/>
+                <w:sz w:val="18"/>
+              </w:rPr>
               <w:t>Miyagi</w:t>
             </w:r>
           </w:p>
@@ -737,7 +1193,14 @@
             <w:tcW w:type="dxa" w:w="2412"/>
           </w:tcPr>
           <w:p>
+            <w:pPr>
+              <w:spacing w:line="240" w:lineRule="auto" w:after="40"/>
+            </w:pPr>
             <w:r>
+              <w:rPr>
+                <w:rFonts w:ascii="Times New Roman" w:hAnsi="Times New Roman"/>
+                <w:sz w:val="18"/>
+              </w:rPr>
               <w:t>Tomiya</w:t>
             </w:r>
           </w:p>
@@ -747,7 +1210,14 @@
             <w:tcW w:type="dxa" w:w="2412"/>
           </w:tcPr>
           <w:p>
+            <w:pPr>
+              <w:spacing w:line="240" w:lineRule="auto" w:after="40"/>
+            </w:pPr>
             <w:r>
+              <w:rPr>
+                <w:rFonts w:ascii="Times New Roman" w:hAnsi="Times New Roman"/>
+                <w:sz w:val="18"/>
+              </w:rPr>
               <w:t>Unit not observed under a single code 2005-2019</w:t>
             </w:r>
           </w:p>
@@ -757,7 +1227,14 @@
             <w:tcW w:type="dxa" w:w="2412"/>
           </w:tcPr>
           <w:p>
+            <w:pPr>
+              <w:spacing w:line="240" w:lineRule="auto" w:after="40"/>
+            </w:pPr>
             <w:r>
+              <w:rPr>
+                <w:rFonts w:ascii="Times New Roman" w:hAnsi="Times New Roman"/>
+                <w:sz w:val="18"/>
+              </w:rPr>
               <w:t>2005,2006,2007,2008,2009,2010,2011,2012,2013,2014,2015,2016</w:t>
             </w:r>
           </w:p>
@@ -769,7 +1246,14 @@
             <w:tcW w:type="dxa" w:w="2412"/>
           </w:tcPr>
           <w:p>
+            <w:pPr>
+              <w:spacing w:line="240" w:lineRule="auto" w:after="40"/>
+            </w:pPr>
             <w:r>
+              <w:rPr>
+                <w:rFonts w:ascii="Times New Roman" w:hAnsi="Times New Roman"/>
+                <w:sz w:val="18"/>
+              </w:rPr>
               <w:t>Miyagi</w:t>
             </w:r>
           </w:p>
@@ -779,7 +1263,14 @@
             <w:tcW w:type="dxa" w:w="2412"/>
           </w:tcPr>
           <w:p>
+            <w:pPr>
+              <w:spacing w:line="240" w:lineRule="auto" w:after="40"/>
+            </w:pPr>
             <w:r>
+              <w:rPr>
+                <w:rFonts w:ascii="Times New Roman" w:hAnsi="Times New Roman"/>
+                <w:sz w:val="18"/>
+              </w:rPr>
               <w:t>Shichikashuku</w:t>
             </w:r>
           </w:p>
@@ -789,7 +1280,14 @@
             <w:tcW w:type="dxa" w:w="2412"/>
           </w:tcPr>
           <w:p>
+            <w:pPr>
+              <w:spacing w:line="240" w:lineRule="auto" w:after="40"/>
+            </w:pPr>
             <w:r>
+              <w:rPr>
+                <w:rFonts w:ascii="Times New Roman" w:hAnsi="Times New Roman"/>
+                <w:sz w:val="18"/>
+              </w:rPr>
               <w:t>Population missing in at least one year 2005-2019</w:t>
             </w:r>
           </w:p>
@@ -799,7 +1297,14 @@
             <w:tcW w:type="dxa" w:w="2412"/>
           </w:tcPr>
           <w:p>
+            <w:pPr>
+              <w:spacing w:line="240" w:lineRule="auto" w:after="40"/>
+            </w:pPr>
             <w:r>
+              <w:rPr>
+                <w:rFonts w:ascii="Times New Roman" w:hAnsi="Times New Roman"/>
+                <w:sz w:val="18"/>
+              </w:rPr>
               <w:t>2007,2008,2009,2010,2011,2012,2013,2014,2015,2016,2017</w:t>
             </w:r>
           </w:p>
@@ -811,7 +1316,14 @@
             <w:tcW w:type="dxa" w:w="2412"/>
           </w:tcPr>
           <w:p>
+            <w:pPr>
+              <w:spacing w:line="240" w:lineRule="auto" w:after="40"/>
+            </w:pPr>
             <w:r>
+              <w:rPr>
+                <w:rFonts w:ascii="Times New Roman" w:hAnsi="Times New Roman"/>
+                <w:sz w:val="18"/>
+              </w:rPr>
               <w:t>Miyagi</w:t>
             </w:r>
           </w:p>
@@ -821,7 +1333,14 @@
             <w:tcW w:type="dxa" w:w="2412"/>
           </w:tcPr>
           <w:p>
+            <w:pPr>
+              <w:spacing w:line="240" w:lineRule="auto" w:after="40"/>
+            </w:pPr>
             <w:r>
+              <w:rPr>
+                <w:rFonts w:ascii="Times New Roman" w:hAnsi="Times New Roman"/>
+                <w:sz w:val="18"/>
+              </w:rPr>
               <w:t>Shichigahama</w:t>
             </w:r>
           </w:p>
@@ -831,7 +1350,14 @@
             <w:tcW w:type="dxa" w:w="2412"/>
           </w:tcPr>
           <w:p>
+            <w:pPr>
+              <w:spacing w:line="240" w:lineRule="auto" w:after="40"/>
+            </w:pPr>
             <w:r>
+              <w:rPr>
+                <w:rFonts w:ascii="Times New Roman" w:hAnsi="Times New Roman"/>
+                <w:sz w:val="18"/>
+              </w:rPr>
               <w:t>Population missing in at least one year 2005-2019</w:t>
             </w:r>
           </w:p>
@@ -841,7 +1367,14 @@
             <w:tcW w:type="dxa" w:w="2412"/>
           </w:tcPr>
           <w:p>
+            <w:pPr>
+              <w:spacing w:line="240" w:lineRule="auto" w:after="40"/>
+            </w:pPr>
             <w:r>
+              <w:rPr>
+                <w:rFonts w:ascii="Times New Roman" w:hAnsi="Times New Roman"/>
+                <w:sz w:val="18"/>
+              </w:rPr>
               <w:t>2007,2008,2009,2010,2011,2012,2013,2014,2015,2016,2017</w:t>
             </w:r>
           </w:p>
@@ -853,7 +1386,14 @@
             <w:tcW w:type="dxa" w:w="2412"/>
           </w:tcPr>
           <w:p>
+            <w:pPr>
+              <w:spacing w:line="240" w:lineRule="auto" w:after="40"/>
+            </w:pPr>
             <w:r>
+              <w:rPr>
+                <w:rFonts w:ascii="Times New Roman" w:hAnsi="Times New Roman"/>
+                <w:sz w:val="18"/>
+              </w:rPr>
               <w:t>Miyagi</w:t>
             </w:r>
           </w:p>
@@ -863,7 +1403,14 @@
             <w:tcW w:type="dxa" w:w="2412"/>
           </w:tcPr>
           <w:p>
+            <w:pPr>
+              <w:spacing w:line="240" w:lineRule="auto" w:after="40"/>
+            </w:pPr>
             <w:r>
+              <w:rPr>
+                <w:rFonts w:ascii="Times New Roman" w:hAnsi="Times New Roman"/>
+                <w:sz w:val="18"/>
+              </w:rPr>
               <w:t>Misato</w:t>
             </w:r>
           </w:p>
@@ -873,7 +1420,14 @@
             <w:tcW w:type="dxa" w:w="2412"/>
           </w:tcPr>
           <w:p>
+            <w:pPr>
+              <w:spacing w:line="240" w:lineRule="auto" w:after="40"/>
+            </w:pPr>
             <w:r>
+              <w:rPr>
+                <w:rFonts w:ascii="Times New Roman" w:hAnsi="Times New Roman"/>
+                <w:sz w:val="18"/>
+              </w:rPr>
               <w:t>Unit not observed under a single code 2005-2019</w:t>
             </w:r>
           </w:p>
@@ -883,7 +1437,14 @@
             <w:tcW w:type="dxa" w:w="2412"/>
           </w:tcPr>
           <w:p>
+            <w:pPr>
+              <w:spacing w:line="240" w:lineRule="auto" w:after="40"/>
+            </w:pPr>
             <w:r>
+              <w:rPr>
+                <w:rFonts w:ascii="Times New Roman" w:hAnsi="Times New Roman"/>
+                <w:sz w:val="18"/>
+              </w:rPr>
               <w:t>2005</w:t>
             </w:r>
           </w:p>
@@ -895,7 +1456,14 @@
             <w:tcW w:type="dxa" w:w="2412"/>
           </w:tcPr>
           <w:p>
+            <w:pPr>
+              <w:spacing w:line="240" w:lineRule="auto" w:after="40"/>
+            </w:pPr>
             <w:r>
+              <w:rPr>
+                <w:rFonts w:ascii="Times New Roman" w:hAnsi="Times New Roman"/>
+                <w:sz w:val="18"/>
+              </w:rPr>
               <w:t>Miyagi</w:t>
             </w:r>
           </w:p>
@@ -905,7 +1473,14 @@
             <w:tcW w:type="dxa" w:w="2412"/>
           </w:tcPr>
           <w:p>
+            <w:pPr>
+              <w:spacing w:line="240" w:lineRule="auto" w:after="40"/>
+            </w:pPr>
             <w:r>
+              <w:rPr>
+                <w:rFonts w:ascii="Times New Roman" w:hAnsi="Times New Roman"/>
+                <w:sz w:val="18"/>
+              </w:rPr>
               <w:t>Minamisanriku</w:t>
             </w:r>
           </w:p>
@@ -915,7 +1490,14 @@
             <w:tcW w:type="dxa" w:w="2412"/>
           </w:tcPr>
           <w:p>
+            <w:pPr>
+              <w:spacing w:line="240" w:lineRule="auto" w:after="40"/>
+            </w:pPr>
             <w:r>
+              <w:rPr>
+                <w:rFonts w:ascii="Times New Roman" w:hAnsi="Times New Roman"/>
+                <w:sz w:val="18"/>
+              </w:rPr>
               <w:t>Population missing in at least one year 2005-2019</w:t>
             </w:r>
           </w:p>
@@ -925,7 +1507,14 @@
             <w:tcW w:type="dxa" w:w="2412"/>
           </w:tcPr>
           <w:p>
+            <w:pPr>
+              <w:spacing w:line="240" w:lineRule="auto" w:after="40"/>
+            </w:pPr>
             <w:r>
+              <w:rPr>
+                <w:rFonts w:ascii="Times New Roman" w:hAnsi="Times New Roman"/>
+                <w:sz w:val="18"/>
+              </w:rPr>
               <w:t>2005</w:t>
             </w:r>
           </w:p>
@@ -937,7 +1526,14 @@
             <w:tcW w:type="dxa" w:w="2412"/>
           </w:tcPr>
           <w:p>
+            <w:pPr>
+              <w:spacing w:line="240" w:lineRule="auto" w:after="40"/>
+            </w:pPr>
             <w:r>
+              <w:rPr>
+                <w:rFonts w:ascii="Times New Roman" w:hAnsi="Times New Roman"/>
+                <w:sz w:val="18"/>
+              </w:rPr>
               <w:t>Yamagata</w:t>
             </w:r>
           </w:p>
@@ -947,7 +1543,14 @@
             <w:tcW w:type="dxa" w:w="2412"/>
           </w:tcPr>
           <w:p>
+            <w:pPr>
+              <w:spacing w:line="240" w:lineRule="auto" w:after="40"/>
+            </w:pPr>
             <w:r>
+              <w:rPr>
+                <w:rFonts w:ascii="Times New Roman" w:hAnsi="Times New Roman"/>
+                <w:sz w:val="18"/>
+              </w:rPr>
               <w:t>Shonai</w:t>
             </w:r>
           </w:p>
@@ -957,7 +1560,14 @@
             <w:tcW w:type="dxa" w:w="2412"/>
           </w:tcPr>
           <w:p>
+            <w:pPr>
+              <w:spacing w:line="240" w:lineRule="auto" w:after="40"/>
+            </w:pPr>
             <w:r>
+              <w:rPr>
+                <w:rFonts w:ascii="Times New Roman" w:hAnsi="Times New Roman"/>
+                <w:sz w:val="18"/>
+              </w:rPr>
               <w:t>Population missing in at least one year 2005-2019</w:t>
             </w:r>
           </w:p>
@@ -967,7 +1577,14 @@
             <w:tcW w:type="dxa" w:w="2412"/>
           </w:tcPr>
           <w:p>
+            <w:pPr>
+              <w:spacing w:line="240" w:lineRule="auto" w:after="40"/>
+            </w:pPr>
             <w:r>
+              <w:rPr>
+                <w:rFonts w:ascii="Times New Roman" w:hAnsi="Times New Roman"/>
+                <w:sz w:val="18"/>
+              </w:rPr>
               <w:t>2005</w:t>
             </w:r>
           </w:p>
@@ -979,7 +1596,14 @@
             <w:tcW w:type="dxa" w:w="2412"/>
           </w:tcPr>
           <w:p>
+            <w:pPr>
+              <w:spacing w:line="240" w:lineRule="auto" w:after="40"/>
+            </w:pPr>
             <w:r>
+              <w:rPr>
+                <w:rFonts w:ascii="Times New Roman" w:hAnsi="Times New Roman"/>
+                <w:sz w:val="18"/>
+              </w:rPr>
               <w:t>Fukushima</w:t>
             </w:r>
           </w:p>
@@ -989,7 +1613,14 @@
             <w:tcW w:type="dxa" w:w="2412"/>
           </w:tcPr>
           <w:p>
+            <w:pPr>
+              <w:spacing w:line="240" w:lineRule="auto" w:after="40"/>
+            </w:pPr>
             <w:r>
+              <w:rPr>
+                <w:rFonts w:ascii="Times New Roman" w:hAnsi="Times New Roman"/>
+                <w:sz w:val="18"/>
+              </w:rPr>
               <w:t>Motomiya</w:t>
             </w:r>
           </w:p>
@@ -999,7 +1630,14 @@
             <w:tcW w:type="dxa" w:w="2412"/>
           </w:tcPr>
           <w:p>
+            <w:pPr>
+              <w:spacing w:line="240" w:lineRule="auto" w:after="40"/>
+            </w:pPr>
             <w:r>
+              <w:rPr>
+                <w:rFonts w:ascii="Times New Roman" w:hAnsi="Times New Roman"/>
+                <w:sz w:val="18"/>
+              </w:rPr>
               <w:t>Population missing in at least one year 2005-2019</w:t>
             </w:r>
           </w:p>
@@ -1009,7 +1647,14 @@
             <w:tcW w:type="dxa" w:w="2412"/>
           </w:tcPr>
           <w:p>
+            <w:pPr>
+              <w:spacing w:line="240" w:lineRule="auto" w:after="40"/>
+            </w:pPr>
             <w:r>
+              <w:rPr>
+                <w:rFonts w:ascii="Times New Roman" w:hAnsi="Times New Roman"/>
+                <w:sz w:val="18"/>
+              </w:rPr>
               <w:t>2006</w:t>
             </w:r>
           </w:p>
@@ -1021,7 +1666,14 @@
             <w:tcW w:type="dxa" w:w="2412"/>
           </w:tcPr>
           <w:p>
+            <w:pPr>
+              <w:spacing w:line="240" w:lineRule="auto" w:after="40"/>
+            </w:pPr>
             <w:r>
+              <w:rPr>
+                <w:rFonts w:ascii="Times New Roman" w:hAnsi="Times New Roman"/>
+                <w:sz w:val="18"/>
+              </w:rPr>
               <w:t>Ibaraki</w:t>
             </w:r>
           </w:p>
@@ -1031,7 +1683,14 @@
             <w:tcW w:type="dxa" w:w="2412"/>
           </w:tcPr>
           <w:p>
+            <w:pPr>
+              <w:spacing w:line="240" w:lineRule="auto" w:after="40"/>
+            </w:pPr>
             <w:r>
+              <w:rPr>
+                <w:rFonts w:ascii="Times New Roman" w:hAnsi="Times New Roman"/>
+                <w:sz w:val="18"/>
+              </w:rPr>
               <w:t>Kasumigaura</w:t>
             </w:r>
           </w:p>
@@ -1041,7 +1700,14 @@
             <w:tcW w:type="dxa" w:w="2412"/>
           </w:tcPr>
           <w:p>
+            <w:pPr>
+              <w:spacing w:line="240" w:lineRule="auto" w:after="40"/>
+            </w:pPr>
             <w:r>
+              <w:rPr>
+                <w:rFonts w:ascii="Times New Roman" w:hAnsi="Times New Roman"/>
+                <w:sz w:val="18"/>
+              </w:rPr>
               <w:t>Population missing in at least one year 2005-2019</w:t>
             </w:r>
           </w:p>
@@ -1051,7 +1717,14 @@
             <w:tcW w:type="dxa" w:w="2412"/>
           </w:tcPr>
           <w:p>
+            <w:pPr>
+              <w:spacing w:line="240" w:lineRule="auto" w:after="40"/>
+            </w:pPr>
             <w:r>
+              <w:rPr>
+                <w:rFonts w:ascii="Times New Roman" w:hAnsi="Times New Roman"/>
+                <w:sz w:val="18"/>
+              </w:rPr>
               <w:t>2006</w:t>
             </w:r>
           </w:p>
@@ -1063,7 +1736,14 @@
             <w:tcW w:type="dxa" w:w="2412"/>
           </w:tcPr>
           <w:p>
+            <w:pPr>
+              <w:spacing w:line="240" w:lineRule="auto" w:after="40"/>
+            </w:pPr>
             <w:r>
+              <w:rPr>
+                <w:rFonts w:ascii="Times New Roman" w:hAnsi="Times New Roman"/>
+                <w:sz w:val="18"/>
+              </w:rPr>
               <w:t>Ibaraki</w:t>
             </w:r>
           </w:p>
@@ -1073,7 +1753,14 @@
             <w:tcW w:type="dxa" w:w="2412"/>
           </w:tcPr>
           <w:p>
+            <w:pPr>
+              <w:spacing w:line="240" w:lineRule="auto" w:after="40"/>
+            </w:pPr>
             <w:r>
+              <w:rPr>
+                <w:rFonts w:ascii="Times New Roman" w:hAnsi="Times New Roman"/>
+                <w:sz w:val="18"/>
+              </w:rPr>
               <w:t>Sakuragawa</w:t>
             </w:r>
           </w:p>
@@ -1083,7 +1770,14 @@
             <w:tcW w:type="dxa" w:w="2412"/>
           </w:tcPr>
           <w:p>
+            <w:pPr>
+              <w:spacing w:line="240" w:lineRule="auto" w:after="40"/>
+            </w:pPr>
             <w:r>
+              <w:rPr>
+                <w:rFonts w:ascii="Times New Roman" w:hAnsi="Times New Roman"/>
+                <w:sz w:val="18"/>
+              </w:rPr>
               <w:t>Population missing in at least one year 2005-2019</w:t>
             </w:r>
           </w:p>
@@ -1093,7 +1787,14 @@
             <w:tcW w:type="dxa" w:w="2412"/>
           </w:tcPr>
           <w:p>
+            <w:pPr>
+              <w:spacing w:line="240" w:lineRule="auto" w:after="40"/>
+            </w:pPr>
             <w:r>
+              <w:rPr>
+                <w:rFonts w:ascii="Times New Roman" w:hAnsi="Times New Roman"/>
+                <w:sz w:val="18"/>
+              </w:rPr>
               <w:t>2005</w:t>
             </w:r>
           </w:p>
@@ -1105,7 +1806,14 @@
             <w:tcW w:type="dxa" w:w="2412"/>
           </w:tcPr>
           <w:p>
+            <w:pPr>
+              <w:spacing w:line="240" w:lineRule="auto" w:after="40"/>
+            </w:pPr>
             <w:r>
+              <w:rPr>
+                <w:rFonts w:ascii="Times New Roman" w:hAnsi="Times New Roman"/>
+                <w:sz w:val="18"/>
+              </w:rPr>
               <w:t>Ibaraki</w:t>
             </w:r>
           </w:p>
@@ -1115,7 +1823,14 @@
             <w:tcW w:type="dxa" w:w="2412"/>
           </w:tcPr>
           <w:p>
+            <w:pPr>
+              <w:spacing w:line="240" w:lineRule="auto" w:after="40"/>
+            </w:pPr>
             <w:r>
+              <w:rPr>
+                <w:rFonts w:ascii="Times New Roman" w:hAnsi="Times New Roman"/>
+                <w:sz w:val="18"/>
+              </w:rPr>
               <w:t>Kamisu</w:t>
             </w:r>
           </w:p>
@@ -1125,7 +1840,14 @@
             <w:tcW w:type="dxa" w:w="2412"/>
           </w:tcPr>
           <w:p>
+            <w:pPr>
+              <w:spacing w:line="240" w:lineRule="auto" w:after="40"/>
+            </w:pPr>
             <w:r>
+              <w:rPr>
+                <w:rFonts w:ascii="Times New Roman" w:hAnsi="Times New Roman"/>
+                <w:sz w:val="18"/>
+              </w:rPr>
               <w:t>Population missing in at least one year 2005-2019</w:t>
             </w:r>
           </w:p>
@@ -1135,7 +1857,14 @@
             <w:tcW w:type="dxa" w:w="2412"/>
           </w:tcPr>
           <w:p>
+            <w:pPr>
+              <w:spacing w:line="240" w:lineRule="auto" w:after="40"/>
+            </w:pPr>
             <w:r>
+              <w:rPr>
+                <w:rFonts w:ascii="Times New Roman" w:hAnsi="Times New Roman"/>
+                <w:sz w:val="18"/>
+              </w:rPr>
               <w:t>2005</w:t>
             </w:r>
           </w:p>
@@ -1147,7 +1876,14 @@
             <w:tcW w:type="dxa" w:w="2412"/>
           </w:tcPr>
           <w:p>
+            <w:pPr>
+              <w:spacing w:line="240" w:lineRule="auto" w:after="40"/>
+            </w:pPr>
             <w:r>
+              <w:rPr>
+                <w:rFonts w:ascii="Times New Roman" w:hAnsi="Times New Roman"/>
+                <w:sz w:val="18"/>
+              </w:rPr>
               <w:t>Ibaraki</w:t>
             </w:r>
           </w:p>
@@ -1157,7 +1893,14 @@
             <w:tcW w:type="dxa" w:w="2412"/>
           </w:tcPr>
           <w:p>
+            <w:pPr>
+              <w:spacing w:line="240" w:lineRule="auto" w:after="40"/>
+            </w:pPr>
             <w:r>
+              <w:rPr>
+                <w:rFonts w:ascii="Times New Roman" w:hAnsi="Times New Roman"/>
+                <w:sz w:val="18"/>
+              </w:rPr>
               <w:t>Namegata</w:t>
             </w:r>
           </w:p>
@@ -1167,7 +1910,14 @@
             <w:tcW w:type="dxa" w:w="2412"/>
           </w:tcPr>
           <w:p>
+            <w:pPr>
+              <w:spacing w:line="240" w:lineRule="auto" w:after="40"/>
+            </w:pPr>
             <w:r>
+              <w:rPr>
+                <w:rFonts w:ascii="Times New Roman" w:hAnsi="Times New Roman"/>
+                <w:sz w:val="18"/>
+              </w:rPr>
               <w:t>Population missing in at least one year 2005-2019</w:t>
             </w:r>
           </w:p>
@@ -1177,7 +1927,14 @@
             <w:tcW w:type="dxa" w:w="2412"/>
           </w:tcPr>
           <w:p>
+            <w:pPr>
+              <w:spacing w:line="240" w:lineRule="auto" w:after="40"/>
+            </w:pPr>
             <w:r>
+              <w:rPr>
+                <w:rFonts w:ascii="Times New Roman" w:hAnsi="Times New Roman"/>
+                <w:sz w:val="18"/>
+              </w:rPr>
               <w:t>2005</w:t>
             </w:r>
           </w:p>
@@ -1189,7 +1946,14 @@
             <w:tcW w:type="dxa" w:w="2412"/>
           </w:tcPr>
           <w:p>
+            <w:pPr>
+              <w:spacing w:line="240" w:lineRule="auto" w:after="40"/>
+            </w:pPr>
             <w:r>
+              <w:rPr>
+                <w:rFonts w:ascii="Times New Roman" w:hAnsi="Times New Roman"/>
+                <w:sz w:val="18"/>
+              </w:rPr>
               <w:t>Ibaraki</w:t>
             </w:r>
           </w:p>
@@ -1199,7 +1963,14 @@
             <w:tcW w:type="dxa" w:w="2412"/>
           </w:tcPr>
           <w:p>
+            <w:pPr>
+              <w:spacing w:line="240" w:lineRule="auto" w:after="40"/>
+            </w:pPr>
             <w:r>
+              <w:rPr>
+                <w:rFonts w:ascii="Times New Roman" w:hAnsi="Times New Roman"/>
+                <w:sz w:val="18"/>
+              </w:rPr>
               <w:t>Hokota</w:t>
             </w:r>
           </w:p>
@@ -1209,7 +1980,14 @@
             <w:tcW w:type="dxa" w:w="2412"/>
           </w:tcPr>
           <w:p>
+            <w:pPr>
+              <w:spacing w:line="240" w:lineRule="auto" w:after="40"/>
+            </w:pPr>
             <w:r>
+              <w:rPr>
+                <w:rFonts w:ascii="Times New Roman" w:hAnsi="Times New Roman"/>
+                <w:sz w:val="18"/>
+              </w:rPr>
               <w:t>Population missing in at least one year 2005-2019</w:t>
             </w:r>
           </w:p>
@@ -1219,7 +1997,14 @@
             <w:tcW w:type="dxa" w:w="2412"/>
           </w:tcPr>
           <w:p>
+            <w:pPr>
+              <w:spacing w:line="240" w:lineRule="auto" w:after="40"/>
+            </w:pPr>
             <w:r>
+              <w:rPr>
+                <w:rFonts w:ascii="Times New Roman" w:hAnsi="Times New Roman"/>
+                <w:sz w:val="18"/>
+              </w:rPr>
               <w:t>2005</w:t>
             </w:r>
           </w:p>
@@ -1231,7 +2016,14 @@
             <w:tcW w:type="dxa" w:w="2412"/>
           </w:tcPr>
           <w:p>
+            <w:pPr>
+              <w:spacing w:line="240" w:lineRule="auto" w:after="40"/>
+            </w:pPr>
             <w:r>
+              <w:rPr>
+                <w:rFonts w:ascii="Times New Roman" w:hAnsi="Times New Roman"/>
+                <w:sz w:val="18"/>
+              </w:rPr>
               <w:t>Ibaraki</w:t>
             </w:r>
           </w:p>
@@ -1241,7 +2033,14 @@
             <w:tcW w:type="dxa" w:w="2412"/>
           </w:tcPr>
           <w:p>
+            <w:pPr>
+              <w:spacing w:line="240" w:lineRule="auto" w:after="40"/>
+            </w:pPr>
             <w:r>
+              <w:rPr>
+                <w:rFonts w:ascii="Times New Roman" w:hAnsi="Times New Roman"/>
+                <w:sz w:val="18"/>
+              </w:rPr>
               <w:t>Tsukubamirai</w:t>
             </w:r>
           </w:p>
@@ -1251,7 +2050,14 @@
             <w:tcW w:type="dxa" w:w="2412"/>
           </w:tcPr>
           <w:p>
+            <w:pPr>
+              <w:spacing w:line="240" w:lineRule="auto" w:after="40"/>
+            </w:pPr>
             <w:r>
+              <w:rPr>
+                <w:rFonts w:ascii="Times New Roman" w:hAnsi="Times New Roman"/>
+                <w:sz w:val="18"/>
+              </w:rPr>
               <w:t>Unit not observed under a single code 2005-2019</w:t>
             </w:r>
           </w:p>
@@ -1261,7 +2067,14 @@
             <w:tcW w:type="dxa" w:w="2412"/>
           </w:tcPr>
           <w:p>
+            <w:pPr>
+              <w:spacing w:line="240" w:lineRule="auto" w:after="40"/>
+            </w:pPr>
             <w:r>
+              <w:rPr>
+                <w:rFonts w:ascii="Times New Roman" w:hAnsi="Times New Roman"/>
+                <w:sz w:val="18"/>
+              </w:rPr>
               <w:t>2005,2006</w:t>
             </w:r>
           </w:p>
@@ -1273,7 +2086,14 @@
             <w:tcW w:type="dxa" w:w="2412"/>
           </w:tcPr>
           <w:p>
+            <w:pPr>
+              <w:spacing w:line="240" w:lineRule="auto" w:after="40"/>
+            </w:pPr>
             <w:r>
+              <w:rPr>
+                <w:rFonts w:ascii="Times New Roman" w:hAnsi="Times New Roman"/>
+                <w:sz w:val="18"/>
+              </w:rPr>
               <w:t>Ibaraki</w:t>
             </w:r>
           </w:p>
@@ -1283,7 +2103,14 @@
             <w:tcW w:type="dxa" w:w="2412"/>
           </w:tcPr>
           <w:p>
+            <w:pPr>
+              <w:spacing w:line="240" w:lineRule="auto" w:after="40"/>
+            </w:pPr>
             <w:r>
+              <w:rPr>
+                <w:rFonts w:ascii="Times New Roman" w:hAnsi="Times New Roman"/>
+                <w:sz w:val="18"/>
+              </w:rPr>
               <w:t>Omitama</w:t>
             </w:r>
           </w:p>
@@ -1293,7 +2120,14 @@
             <w:tcW w:type="dxa" w:w="2412"/>
           </w:tcPr>
           <w:p>
+            <w:pPr>
+              <w:spacing w:line="240" w:lineRule="auto" w:after="40"/>
+            </w:pPr>
             <w:r>
+              <w:rPr>
+                <w:rFonts w:ascii="Times New Roman" w:hAnsi="Times New Roman"/>
+                <w:sz w:val="18"/>
+              </w:rPr>
               <w:t>Unit not observed under a single code 2005-2019</w:t>
             </w:r>
           </w:p>
@@ -1303,7 +2137,14 @@
             <w:tcW w:type="dxa" w:w="2412"/>
           </w:tcPr>
           <w:p>
+            <w:pPr>
+              <w:spacing w:line="240" w:lineRule="auto" w:after="40"/>
+            </w:pPr>
             <w:r>
+              <w:rPr>
+                <w:rFonts w:ascii="Times New Roman" w:hAnsi="Times New Roman"/>
+                <w:sz w:val="18"/>
+              </w:rPr>
               <w:t>2005</w:t>
             </w:r>
           </w:p>
@@ -1315,7 +2156,14 @@
             <w:tcW w:type="dxa" w:w="2412"/>
           </w:tcPr>
           <w:p>
+            <w:pPr>
+              <w:spacing w:line="240" w:lineRule="auto" w:after="40"/>
+            </w:pPr>
             <w:r>
+              <w:rPr>
+                <w:rFonts w:ascii="Times New Roman" w:hAnsi="Times New Roman"/>
+                <w:sz w:val="18"/>
+              </w:rPr>
               <w:t>Tochigi</w:t>
             </w:r>
           </w:p>
@@ -1325,7 +2173,14 @@
             <w:tcW w:type="dxa" w:w="2412"/>
           </w:tcPr>
           <w:p>
+            <w:pPr>
+              <w:spacing w:line="240" w:lineRule="auto" w:after="40"/>
+            </w:pPr>
             <w:r>
+              <w:rPr>
+                <w:rFonts w:ascii="Times New Roman" w:hAnsi="Times New Roman"/>
+                <w:sz w:val="18"/>
+              </w:rPr>
               <w:t>Nasukarasuyama</w:t>
             </w:r>
           </w:p>
@@ -1335,7 +2190,14 @@
             <w:tcW w:type="dxa" w:w="2412"/>
           </w:tcPr>
           <w:p>
+            <w:pPr>
+              <w:spacing w:line="240" w:lineRule="auto" w:after="40"/>
+            </w:pPr>
             <w:r>
+              <w:rPr>
+                <w:rFonts w:ascii="Times New Roman" w:hAnsi="Times New Roman"/>
+                <w:sz w:val="18"/>
+              </w:rPr>
               <w:t>Population missing in at least one year 2005-2019</w:t>
             </w:r>
           </w:p>
@@ -1345,7 +2207,14 @@
             <w:tcW w:type="dxa" w:w="2412"/>
           </w:tcPr>
           <w:p>
+            <w:pPr>
+              <w:spacing w:line="240" w:lineRule="auto" w:after="40"/>
+            </w:pPr>
             <w:r>
+              <w:rPr>
+                <w:rFonts w:ascii="Times New Roman" w:hAnsi="Times New Roman"/>
+                <w:sz w:val="18"/>
+              </w:rPr>
               <w:t>2005</w:t>
             </w:r>
           </w:p>
@@ -1357,7 +2226,14 @@
             <w:tcW w:type="dxa" w:w="2412"/>
           </w:tcPr>
           <w:p>
+            <w:pPr>
+              <w:spacing w:line="240" w:lineRule="auto" w:after="40"/>
+            </w:pPr>
             <w:r>
+              <w:rPr>
+                <w:rFonts w:ascii="Times New Roman" w:hAnsi="Times New Roman"/>
+                <w:sz w:val="18"/>
+              </w:rPr>
               <w:t>Tochigi</w:t>
             </w:r>
           </w:p>
@@ -1367,7 +2243,14 @@
             <w:tcW w:type="dxa" w:w="2412"/>
           </w:tcPr>
           <w:p>
+            <w:pPr>
+              <w:spacing w:line="240" w:lineRule="auto" w:after="40"/>
+            </w:pPr>
             <w:r>
+              <w:rPr>
+                <w:rFonts w:ascii="Times New Roman" w:hAnsi="Times New Roman"/>
+                <w:sz w:val="18"/>
+              </w:rPr>
               <w:t>Shimotsuke</w:t>
             </w:r>
           </w:p>
@@ -1377,7 +2260,14 @@
             <w:tcW w:type="dxa" w:w="2412"/>
           </w:tcPr>
           <w:p>
+            <w:pPr>
+              <w:spacing w:line="240" w:lineRule="auto" w:after="40"/>
+            </w:pPr>
             <w:r>
+              <w:rPr>
+                <w:rFonts w:ascii="Times New Roman" w:hAnsi="Times New Roman"/>
+                <w:sz w:val="18"/>
+              </w:rPr>
               <w:t>Unit not observed under a single code 2005-2019</w:t>
             </w:r>
           </w:p>
@@ -1387,7 +2277,14 @@
             <w:tcW w:type="dxa" w:w="2412"/>
           </w:tcPr>
           <w:p>
+            <w:pPr>
+              <w:spacing w:line="240" w:lineRule="auto" w:after="40"/>
+            </w:pPr>
             <w:r>
+              <w:rPr>
+                <w:rFonts w:ascii="Times New Roman" w:hAnsi="Times New Roman"/>
+                <w:sz w:val="18"/>
+              </w:rPr>
               <w:t>2005</w:t>
             </w:r>
           </w:p>
@@ -1399,7 +2296,14 @@
             <w:tcW w:type="dxa" w:w="2412"/>
           </w:tcPr>
           <w:p>
+            <w:pPr>
+              <w:spacing w:line="240" w:lineRule="auto" w:after="40"/>
+            </w:pPr>
             <w:r>
+              <w:rPr>
+                <w:rFonts w:ascii="Times New Roman" w:hAnsi="Times New Roman"/>
+                <w:sz w:val="18"/>
+              </w:rPr>
               <w:t>Tochigi</w:t>
             </w:r>
           </w:p>
@@ -1409,7 +2313,14 @@
             <w:tcW w:type="dxa" w:w="2412"/>
           </w:tcPr>
           <w:p>
+            <w:pPr>
+              <w:spacing w:line="240" w:lineRule="auto" w:after="40"/>
+            </w:pPr>
             <w:r>
+              <w:rPr>
+                <w:rFonts w:ascii="Times New Roman" w:hAnsi="Times New Roman"/>
+                <w:sz w:val="18"/>
+              </w:rPr>
               <w:t>Nakagawa</w:t>
             </w:r>
           </w:p>
@@ -1419,7 +2330,14 @@
             <w:tcW w:type="dxa" w:w="2412"/>
           </w:tcPr>
           <w:p>
+            <w:pPr>
+              <w:spacing w:line="240" w:lineRule="auto" w:after="40"/>
+            </w:pPr>
             <w:r>
+              <w:rPr>
+                <w:rFonts w:ascii="Times New Roman" w:hAnsi="Times New Roman"/>
+                <w:sz w:val="18"/>
+              </w:rPr>
               <w:t>Population missing in at least one year 2005-2019</w:t>
             </w:r>
           </w:p>
@@ -1429,7 +2347,14 @@
             <w:tcW w:type="dxa" w:w="2412"/>
           </w:tcPr>
           <w:p>
+            <w:pPr>
+              <w:spacing w:line="240" w:lineRule="auto" w:after="40"/>
+            </w:pPr>
             <w:r>
+              <w:rPr>
+                <w:rFonts w:ascii="Times New Roman" w:hAnsi="Times New Roman"/>
+                <w:sz w:val="18"/>
+              </w:rPr>
               <w:t>2005</w:t>
             </w:r>
           </w:p>
@@ -1441,7 +2366,14 @@
             <w:tcW w:type="dxa" w:w="2412"/>
           </w:tcPr>
           <w:p>
+            <w:pPr>
+              <w:spacing w:line="240" w:lineRule="auto" w:after="40"/>
+            </w:pPr>
             <w:r>
+              <w:rPr>
+                <w:rFonts w:ascii="Times New Roman" w:hAnsi="Times New Roman"/>
+                <w:sz w:val="18"/>
+              </w:rPr>
               <w:t>Gunma</w:t>
             </w:r>
           </w:p>
@@ -1451,7 +2383,14 @@
             <w:tcW w:type="dxa" w:w="2412"/>
           </w:tcPr>
           <w:p>
+            <w:pPr>
+              <w:spacing w:line="240" w:lineRule="auto" w:after="40"/>
+            </w:pPr>
             <w:r>
+              <w:rPr>
+                <w:rFonts w:ascii="Times New Roman" w:hAnsi="Times New Roman"/>
+                <w:sz w:val="18"/>
+              </w:rPr>
               <w:t>Midori</w:t>
             </w:r>
           </w:p>
@@ -1461,7 +2400,14 @@
             <w:tcW w:type="dxa" w:w="2412"/>
           </w:tcPr>
           <w:p>
+            <w:pPr>
+              <w:spacing w:line="240" w:lineRule="auto" w:after="40"/>
+            </w:pPr>
             <w:r>
+              <w:rPr>
+                <w:rFonts w:ascii="Times New Roman" w:hAnsi="Times New Roman"/>
+                <w:sz w:val="18"/>
+              </w:rPr>
               <w:t>Unit not observed under a single code 2005-2019</w:t>
             </w:r>
           </w:p>
@@ -1471,7 +2417,14 @@
             <w:tcW w:type="dxa" w:w="2412"/>
           </w:tcPr>
           <w:p>
+            <w:pPr>
+              <w:spacing w:line="240" w:lineRule="auto" w:after="40"/>
+            </w:pPr>
             <w:r>
+              <w:rPr>
+                <w:rFonts w:ascii="Times New Roman" w:hAnsi="Times New Roman"/>
+                <w:sz w:val="18"/>
+              </w:rPr>
               <w:t>2005</w:t>
             </w:r>
           </w:p>
@@ -1483,7 +2436,14 @@
             <w:tcW w:type="dxa" w:w="2412"/>
           </w:tcPr>
           <w:p>
+            <w:pPr>
+              <w:spacing w:line="240" w:lineRule="auto" w:after="40"/>
+            </w:pPr>
             <w:r>
+              <w:rPr>
+                <w:rFonts w:ascii="Times New Roman" w:hAnsi="Times New Roman"/>
+                <w:sz w:val="18"/>
+              </w:rPr>
               <w:t>Gunma</w:t>
             </w:r>
           </w:p>
@@ -1493,7 +2453,14 @@
             <w:tcW w:type="dxa" w:w="2412"/>
           </w:tcPr>
           <w:p>
+            <w:pPr>
+              <w:spacing w:line="240" w:lineRule="auto" w:after="40"/>
+            </w:pPr>
             <w:r>
+              <w:rPr>
+                <w:rFonts w:ascii="Times New Roman" w:hAnsi="Times New Roman"/>
+                <w:sz w:val="18"/>
+              </w:rPr>
               <w:t>Higashiazuma</w:t>
             </w:r>
           </w:p>
@@ -1503,7 +2470,14 @@
             <w:tcW w:type="dxa" w:w="2412"/>
           </w:tcPr>
           <w:p>
+            <w:pPr>
+              <w:spacing w:line="240" w:lineRule="auto" w:after="40"/>
+            </w:pPr>
             <w:r>
+              <w:rPr>
+                <w:rFonts w:ascii="Times New Roman" w:hAnsi="Times New Roman"/>
+                <w:sz w:val="18"/>
+              </w:rPr>
               <w:t>Unit not observed under a single code 2005-2019</w:t>
             </w:r>
           </w:p>
@@ -1513,7 +2487,14 @@
             <w:tcW w:type="dxa" w:w="2412"/>
           </w:tcPr>
           <w:p>
+            <w:pPr>
+              <w:spacing w:line="240" w:lineRule="auto" w:after="40"/>
+            </w:pPr>
             <w:r>
+              <w:rPr>
+                <w:rFonts w:ascii="Times New Roman" w:hAnsi="Times New Roman"/>
+                <w:sz w:val="18"/>
+              </w:rPr>
               <w:t>2005</w:t>
             </w:r>
           </w:p>
@@ -1525,7 +2506,14 @@
             <w:tcW w:type="dxa" w:w="2412"/>
           </w:tcPr>
           <w:p>
+            <w:pPr>
+              <w:spacing w:line="240" w:lineRule="auto" w:after="40"/>
+            </w:pPr>
             <w:r>
+              <w:rPr>
+                <w:rFonts w:ascii="Times New Roman" w:hAnsi="Times New Roman"/>
+                <w:sz w:val="18"/>
+              </w:rPr>
               <w:t>Gunma</w:t>
             </w:r>
           </w:p>
@@ -1535,7 +2523,14 @@
             <w:tcW w:type="dxa" w:w="2412"/>
           </w:tcPr>
           <w:p>
+            <w:pPr>
+              <w:spacing w:line="240" w:lineRule="auto" w:after="40"/>
+            </w:pPr>
             <w:r>
+              <w:rPr>
+                <w:rFonts w:ascii="Times New Roman" w:hAnsi="Times New Roman"/>
+                <w:sz w:val="18"/>
+              </w:rPr>
               <w:t>Minakami</w:t>
             </w:r>
           </w:p>
@@ -1545,7 +2540,14 @@
             <w:tcW w:type="dxa" w:w="2412"/>
           </w:tcPr>
           <w:p>
+            <w:pPr>
+              <w:spacing w:line="240" w:lineRule="auto" w:after="40"/>
+            </w:pPr>
             <w:r>
+              <w:rPr>
+                <w:rFonts w:ascii="Times New Roman" w:hAnsi="Times New Roman"/>
+                <w:sz w:val="18"/>
+              </w:rPr>
               <w:t>Population missing in at least one year 2005-2019</w:t>
             </w:r>
           </w:p>
@@ -1555,7 +2557,14 @@
             <w:tcW w:type="dxa" w:w="2412"/>
           </w:tcPr>
           <w:p>
+            <w:pPr>
+              <w:spacing w:line="240" w:lineRule="auto" w:after="40"/>
+            </w:pPr>
             <w:r>
+              <w:rPr>
+                <w:rFonts w:ascii="Times New Roman" w:hAnsi="Times New Roman"/>
+                <w:sz w:val="18"/>
+              </w:rPr>
               <w:t>2005</w:t>
             </w:r>
           </w:p>
@@ -1567,7 +2576,14 @@
             <w:tcW w:type="dxa" w:w="2412"/>
           </w:tcPr>
           <w:p>
+            <w:pPr>
+              <w:spacing w:line="240" w:lineRule="auto" w:after="40"/>
+            </w:pPr>
             <w:r>
+              <w:rPr>
+                <w:rFonts w:ascii="Times New Roman" w:hAnsi="Times New Roman"/>
+                <w:sz w:val="18"/>
+              </w:rPr>
               <w:t>Niigata</w:t>
             </w:r>
           </w:p>
@@ -1577,7 +2593,14 @@
             <w:tcW w:type="dxa" w:w="2412"/>
           </w:tcPr>
           <w:p>
+            <w:pPr>
+              <w:spacing w:line="240" w:lineRule="auto" w:after="40"/>
+            </w:pPr>
             <w:r>
+              <w:rPr>
+                <w:rFonts w:ascii="Times New Roman" w:hAnsi="Times New Roman"/>
+                <w:sz w:val="18"/>
+              </w:rPr>
               <w:t>Kita Ward, Niigata</w:t>
             </w:r>
           </w:p>
@@ -1587,7 +2610,14 @@
             <w:tcW w:type="dxa" w:w="2412"/>
           </w:tcPr>
           <w:p>
+            <w:pPr>
+              <w:spacing w:line="240" w:lineRule="auto" w:after="40"/>
+            </w:pPr>
             <w:r>
+              <w:rPr>
+                <w:rFonts w:ascii="Times New Roman" w:hAnsi="Times New Roman"/>
+                <w:sz w:val="18"/>
+              </w:rPr>
               <w:t>Unit not observed under a single code 2005-2019</w:t>
             </w:r>
           </w:p>
@@ -1597,7 +2627,14 @@
             <w:tcW w:type="dxa" w:w="2412"/>
           </w:tcPr>
           <w:p>
+            <w:pPr>
+              <w:spacing w:line="240" w:lineRule="auto" w:after="40"/>
+            </w:pPr>
             <w:r>
+              <w:rPr>
+                <w:rFonts w:ascii="Times New Roman" w:hAnsi="Times New Roman"/>
+                <w:sz w:val="18"/>
+              </w:rPr>
               <w:t>2005,2006,2007,2008,2009,2010</w:t>
             </w:r>
           </w:p>
@@ -1609,7 +2646,14 @@
             <w:tcW w:type="dxa" w:w="2412"/>
           </w:tcPr>
           <w:p>
+            <w:pPr>
+              <w:spacing w:line="240" w:lineRule="auto" w:after="40"/>
+            </w:pPr>
             <w:r>
+              <w:rPr>
+                <w:rFonts w:ascii="Times New Roman" w:hAnsi="Times New Roman"/>
+                <w:sz w:val="18"/>
+              </w:rPr>
               <w:t>Niigata</w:t>
             </w:r>
           </w:p>
@@ -1619,7 +2663,14 @@
             <w:tcW w:type="dxa" w:w="2412"/>
           </w:tcPr>
           <w:p>
+            <w:pPr>
+              <w:spacing w:line="240" w:lineRule="auto" w:after="40"/>
+            </w:pPr>
             <w:r>
+              <w:rPr>
+                <w:rFonts w:ascii="Times New Roman" w:hAnsi="Times New Roman"/>
+                <w:sz w:val="18"/>
+              </w:rPr>
               <w:t>Higashi Ward, Niigata</w:t>
             </w:r>
           </w:p>
@@ -1629,7 +2680,14 @@
             <w:tcW w:type="dxa" w:w="2412"/>
           </w:tcPr>
           <w:p>
+            <w:pPr>
+              <w:spacing w:line="240" w:lineRule="auto" w:after="40"/>
+            </w:pPr>
             <w:r>
+              <w:rPr>
+                <w:rFonts w:ascii="Times New Roman" w:hAnsi="Times New Roman"/>
+                <w:sz w:val="18"/>
+              </w:rPr>
               <w:t>Unit not observed under a single code 2005-2019</w:t>
             </w:r>
           </w:p>
@@ -1639,7 +2697,14 @@
             <w:tcW w:type="dxa" w:w="2412"/>
           </w:tcPr>
           <w:p>
+            <w:pPr>
+              <w:spacing w:line="240" w:lineRule="auto" w:after="40"/>
+            </w:pPr>
             <w:r>
+              <w:rPr>
+                <w:rFonts w:ascii="Times New Roman" w:hAnsi="Times New Roman"/>
+                <w:sz w:val="18"/>
+              </w:rPr>
               <w:t>2005,2006,2007,2008,2009,2010</w:t>
             </w:r>
           </w:p>
@@ -1651,7 +2716,14 @@
             <w:tcW w:type="dxa" w:w="2412"/>
           </w:tcPr>
           <w:p>
+            <w:pPr>
+              <w:spacing w:line="240" w:lineRule="auto" w:after="40"/>
+            </w:pPr>
             <w:r>
+              <w:rPr>
+                <w:rFonts w:ascii="Times New Roman" w:hAnsi="Times New Roman"/>
+                <w:sz w:val="18"/>
+              </w:rPr>
               <w:t>Niigata</w:t>
             </w:r>
           </w:p>
@@ -1661,7 +2733,14 @@
             <w:tcW w:type="dxa" w:w="2412"/>
           </w:tcPr>
           <w:p>
+            <w:pPr>
+              <w:spacing w:line="240" w:lineRule="auto" w:after="40"/>
+            </w:pPr>
             <w:r>
+              <w:rPr>
+                <w:rFonts w:ascii="Times New Roman" w:hAnsi="Times New Roman"/>
+                <w:sz w:val="18"/>
+              </w:rPr>
               <w:t>Chuo Ward, Niigata</w:t>
             </w:r>
           </w:p>
@@ -1671,7 +2750,14 @@
             <w:tcW w:type="dxa" w:w="2412"/>
           </w:tcPr>
           <w:p>
+            <w:pPr>
+              <w:spacing w:line="240" w:lineRule="auto" w:after="40"/>
+            </w:pPr>
             <w:r>
+              <w:rPr>
+                <w:rFonts w:ascii="Times New Roman" w:hAnsi="Times New Roman"/>
+                <w:sz w:val="18"/>
+              </w:rPr>
               <w:t>Unit not observed under a single code 2005-2019</w:t>
             </w:r>
           </w:p>
@@ -1681,7 +2767,14 @@
             <w:tcW w:type="dxa" w:w="2412"/>
           </w:tcPr>
           <w:p>
+            <w:pPr>
+              <w:spacing w:line="240" w:lineRule="auto" w:after="40"/>
+            </w:pPr>
             <w:r>
+              <w:rPr>
+                <w:rFonts w:ascii="Times New Roman" w:hAnsi="Times New Roman"/>
+                <w:sz w:val="18"/>
+              </w:rPr>
               <w:t>2005,2006,2007,2008,2009,2010</w:t>
             </w:r>
           </w:p>
@@ -1693,7 +2786,14 @@
             <w:tcW w:type="dxa" w:w="2412"/>
           </w:tcPr>
           <w:p>
+            <w:pPr>
+              <w:spacing w:line="240" w:lineRule="auto" w:after="40"/>
+            </w:pPr>
             <w:r>
+              <w:rPr>
+                <w:rFonts w:ascii="Times New Roman" w:hAnsi="Times New Roman"/>
+                <w:sz w:val="18"/>
+              </w:rPr>
               <w:t>Niigata</w:t>
             </w:r>
           </w:p>
@@ -1703,7 +2803,14 @@
             <w:tcW w:type="dxa" w:w="2412"/>
           </w:tcPr>
           <w:p>
+            <w:pPr>
+              <w:spacing w:line="240" w:lineRule="auto" w:after="40"/>
+            </w:pPr>
             <w:r>
+              <w:rPr>
+                <w:rFonts w:ascii="Times New Roman" w:hAnsi="Times New Roman"/>
+                <w:sz w:val="18"/>
+              </w:rPr>
               <w:t>Konan Ward, Niigata</w:t>
             </w:r>
           </w:p>
@@ -1713,7 +2820,14 @@
             <w:tcW w:type="dxa" w:w="2412"/>
           </w:tcPr>
           <w:p>
+            <w:pPr>
+              <w:spacing w:line="240" w:lineRule="auto" w:after="40"/>
+            </w:pPr>
             <w:r>
+              <w:rPr>
+                <w:rFonts w:ascii="Times New Roman" w:hAnsi="Times New Roman"/>
+                <w:sz w:val="18"/>
+              </w:rPr>
               <w:t>Unit not observed under a single code 2005-2019</w:t>
             </w:r>
           </w:p>
@@ -1723,7 +2837,14 @@
             <w:tcW w:type="dxa" w:w="2412"/>
           </w:tcPr>
           <w:p>
+            <w:pPr>
+              <w:spacing w:line="240" w:lineRule="auto" w:after="40"/>
+            </w:pPr>
             <w:r>
+              <w:rPr>
+                <w:rFonts w:ascii="Times New Roman" w:hAnsi="Times New Roman"/>
+                <w:sz w:val="18"/>
+              </w:rPr>
               <w:t>2005,2006,2007,2008,2009,2010</w:t>
             </w:r>
           </w:p>
@@ -1735,7 +2856,14 @@
             <w:tcW w:type="dxa" w:w="2412"/>
           </w:tcPr>
           <w:p>
+            <w:pPr>
+              <w:spacing w:line="240" w:lineRule="auto" w:after="40"/>
+            </w:pPr>
             <w:r>
+              <w:rPr>
+                <w:rFonts w:ascii="Times New Roman" w:hAnsi="Times New Roman"/>
+                <w:sz w:val="18"/>
+              </w:rPr>
               <w:t>Niigata</w:t>
             </w:r>
           </w:p>
@@ -1745,7 +2873,14 @@
             <w:tcW w:type="dxa" w:w="2412"/>
           </w:tcPr>
           <w:p>
+            <w:pPr>
+              <w:spacing w:line="240" w:lineRule="auto" w:after="40"/>
+            </w:pPr>
             <w:r>
+              <w:rPr>
+                <w:rFonts w:ascii="Times New Roman" w:hAnsi="Times New Roman"/>
+                <w:sz w:val="18"/>
+              </w:rPr>
               <w:t>Akiha Ward, Niigata</w:t>
             </w:r>
           </w:p>
@@ -1755,7 +2890,14 @@
             <w:tcW w:type="dxa" w:w="2412"/>
           </w:tcPr>
           <w:p>
+            <w:pPr>
+              <w:spacing w:line="240" w:lineRule="auto" w:after="40"/>
+            </w:pPr>
             <w:r>
+              <w:rPr>
+                <w:rFonts w:ascii="Times New Roman" w:hAnsi="Times New Roman"/>
+                <w:sz w:val="18"/>
+              </w:rPr>
               <w:t>Unit not observed under a single code 2005-2019</w:t>
             </w:r>
           </w:p>
@@ -1765,7 +2907,14 @@
             <w:tcW w:type="dxa" w:w="2412"/>
           </w:tcPr>
           <w:p>
+            <w:pPr>
+              <w:spacing w:line="240" w:lineRule="auto" w:after="40"/>
+            </w:pPr>
             <w:r>
+              <w:rPr>
+                <w:rFonts w:ascii="Times New Roman" w:hAnsi="Times New Roman"/>
+                <w:sz w:val="18"/>
+              </w:rPr>
               <w:t>2005,2006,2007,2008,2009,2010</w:t>
             </w:r>
           </w:p>
@@ -1777,7 +2926,14 @@
             <w:tcW w:type="dxa" w:w="2412"/>
           </w:tcPr>
           <w:p>
+            <w:pPr>
+              <w:spacing w:line="240" w:lineRule="auto" w:after="40"/>
+            </w:pPr>
             <w:r>
+              <w:rPr>
+                <w:rFonts w:ascii="Times New Roman" w:hAnsi="Times New Roman"/>
+                <w:sz w:val="18"/>
+              </w:rPr>
               <w:t>Niigata</w:t>
             </w:r>
           </w:p>
@@ -1787,7 +2943,14 @@
             <w:tcW w:type="dxa" w:w="2412"/>
           </w:tcPr>
           <w:p>
+            <w:pPr>
+              <w:spacing w:line="240" w:lineRule="auto" w:after="40"/>
+            </w:pPr>
             <w:r>
+              <w:rPr>
+                <w:rFonts w:ascii="Times New Roman" w:hAnsi="Times New Roman"/>
+                <w:sz w:val="18"/>
+              </w:rPr>
               <w:t>Minami Ward, Niigata</w:t>
             </w:r>
           </w:p>
@@ -1797,7 +2960,14 @@
             <w:tcW w:type="dxa" w:w="2412"/>
           </w:tcPr>
           <w:p>
+            <w:pPr>
+              <w:spacing w:line="240" w:lineRule="auto" w:after="40"/>
+            </w:pPr>
             <w:r>
+              <w:rPr>
+                <w:rFonts w:ascii="Times New Roman" w:hAnsi="Times New Roman"/>
+                <w:sz w:val="18"/>
+              </w:rPr>
               <w:t>Unit not observed under a single code 2005-2019</w:t>
             </w:r>
           </w:p>
@@ -1807,7 +2977,14 @@
             <w:tcW w:type="dxa" w:w="2412"/>
           </w:tcPr>
           <w:p>
+            <w:pPr>
+              <w:spacing w:line="240" w:lineRule="auto" w:after="40"/>
+            </w:pPr>
             <w:r>
+              <w:rPr>
+                <w:rFonts w:ascii="Times New Roman" w:hAnsi="Times New Roman"/>
+                <w:sz w:val="18"/>
+              </w:rPr>
               <w:t>2005,2006,2007,2008,2009,2010</w:t>
             </w:r>
           </w:p>
@@ -1819,7 +2996,14 @@
             <w:tcW w:type="dxa" w:w="2412"/>
           </w:tcPr>
           <w:p>
+            <w:pPr>
+              <w:spacing w:line="240" w:lineRule="auto" w:after="40"/>
+            </w:pPr>
             <w:r>
+              <w:rPr>
+                <w:rFonts w:ascii="Times New Roman" w:hAnsi="Times New Roman"/>
+                <w:sz w:val="18"/>
+              </w:rPr>
               <w:t>Niigata</w:t>
             </w:r>
           </w:p>
@@ -1829,7 +3013,14 @@
             <w:tcW w:type="dxa" w:w="2412"/>
           </w:tcPr>
           <w:p>
+            <w:pPr>
+              <w:spacing w:line="240" w:lineRule="auto" w:after="40"/>
+            </w:pPr>
             <w:r>
+              <w:rPr>
+                <w:rFonts w:ascii="Times New Roman" w:hAnsi="Times New Roman"/>
+                <w:sz w:val="18"/>
+              </w:rPr>
               <w:t>Nishi Ward, Niigata</w:t>
             </w:r>
           </w:p>
@@ -1839,7 +3030,14 @@
             <w:tcW w:type="dxa" w:w="2412"/>
           </w:tcPr>
           <w:p>
+            <w:pPr>
+              <w:spacing w:line="240" w:lineRule="auto" w:after="40"/>
+            </w:pPr>
             <w:r>
+              <w:rPr>
+                <w:rFonts w:ascii="Times New Roman" w:hAnsi="Times New Roman"/>
+                <w:sz w:val="18"/>
+              </w:rPr>
               <w:t>Unit not observed under a single code 2005-2019</w:t>
             </w:r>
           </w:p>
@@ -1849,7 +3047,14 @@
             <w:tcW w:type="dxa" w:w="2412"/>
           </w:tcPr>
           <w:p>
+            <w:pPr>
+              <w:spacing w:line="240" w:lineRule="auto" w:after="40"/>
+            </w:pPr>
             <w:r>
+              <w:rPr>
+                <w:rFonts w:ascii="Times New Roman" w:hAnsi="Times New Roman"/>
+                <w:sz w:val="18"/>
+              </w:rPr>
               <w:t>2005,2006,2007,2008,2009,2010</w:t>
             </w:r>
           </w:p>
@@ -1861,7 +3066,14 @@
             <w:tcW w:type="dxa" w:w="2412"/>
           </w:tcPr>
           <w:p>
+            <w:pPr>
+              <w:spacing w:line="240" w:lineRule="auto" w:after="40"/>
+            </w:pPr>
             <w:r>
+              <w:rPr>
+                <w:rFonts w:ascii="Times New Roman" w:hAnsi="Times New Roman"/>
+                <w:sz w:val="18"/>
+              </w:rPr>
               <w:t>Niigata</w:t>
             </w:r>
           </w:p>
@@ -1871,7 +3083,14 @@
             <w:tcW w:type="dxa" w:w="2412"/>
           </w:tcPr>
           <w:p>
+            <w:pPr>
+              <w:spacing w:line="240" w:lineRule="auto" w:after="40"/>
+            </w:pPr>
             <w:r>
+              <w:rPr>
+                <w:rFonts w:ascii="Times New Roman" w:hAnsi="Times New Roman"/>
+                <w:sz w:val="18"/>
+              </w:rPr>
               <w:t>Nishikan Ward, Niigata</w:t>
             </w:r>
           </w:p>
@@ -1881,7 +3100,14 @@
             <w:tcW w:type="dxa" w:w="2412"/>
           </w:tcPr>
           <w:p>
+            <w:pPr>
+              <w:spacing w:line="240" w:lineRule="auto" w:after="40"/>
+            </w:pPr>
             <w:r>
+              <w:rPr>
+                <w:rFonts w:ascii="Times New Roman" w:hAnsi="Times New Roman"/>
+                <w:sz w:val="18"/>
+              </w:rPr>
               <w:t>Unit not observed under a single code 2005-2019</w:t>
             </w:r>
           </w:p>
@@ -1891,7 +3117,14 @@
             <w:tcW w:type="dxa" w:w="2412"/>
           </w:tcPr>
           <w:p>
+            <w:pPr>
+              <w:spacing w:line="240" w:lineRule="auto" w:after="40"/>
+            </w:pPr>
             <w:r>
+              <w:rPr>
+                <w:rFonts w:ascii="Times New Roman" w:hAnsi="Times New Roman"/>
+                <w:sz w:val="18"/>
+              </w:rPr>
               <w:t>2005,2006,2007,2008,2009,2010</w:t>
             </w:r>
           </w:p>
@@ -1903,7 +3136,14 @@
             <w:tcW w:type="dxa" w:w="2412"/>
           </w:tcPr>
           <w:p>
+            <w:pPr>
+              <w:spacing w:line="240" w:lineRule="auto" w:after="40"/>
+            </w:pPr>
             <w:r>
+              <w:rPr>
+                <w:rFonts w:ascii="Times New Roman" w:hAnsi="Times New Roman"/>
+                <w:sz w:val="18"/>
+              </w:rPr>
               <w:t>Niigata</w:t>
             </w:r>
           </w:p>
@@ -1913,7 +3153,14 @@
             <w:tcW w:type="dxa" w:w="2412"/>
           </w:tcPr>
           <w:p>
+            <w:pPr>
+              <w:spacing w:line="240" w:lineRule="auto" w:after="40"/>
+            </w:pPr>
             <w:r>
+              <w:rPr>
+                <w:rFonts w:ascii="Times New Roman" w:hAnsi="Times New Roman"/>
+                <w:sz w:val="18"/>
+              </w:rPr>
               <w:t>Myoko</w:t>
             </w:r>
           </w:p>
@@ -1923,7 +3170,14 @@
             <w:tcW w:type="dxa" w:w="2412"/>
           </w:tcPr>
           <w:p>
+            <w:pPr>
+              <w:spacing w:line="240" w:lineRule="auto" w:after="40"/>
+            </w:pPr>
             <w:r>
+              <w:rPr>
+                <w:rFonts w:ascii="Times New Roman" w:hAnsi="Times New Roman"/>
+                <w:sz w:val="18"/>
+              </w:rPr>
               <w:t>Population missing in at least one year 2005-2019</w:t>
             </w:r>
           </w:p>
@@ -1933,7 +3187,14 @@
             <w:tcW w:type="dxa" w:w="2412"/>
           </w:tcPr>
           <w:p>
+            <w:pPr>
+              <w:spacing w:line="240" w:lineRule="auto" w:after="40"/>
+            </w:pPr>
             <w:r>
+              <w:rPr>
+                <w:rFonts w:ascii="Times New Roman" w:hAnsi="Times New Roman"/>
+                <w:sz w:val="18"/>
+              </w:rPr>
               <w:t>2005</w:t>
             </w:r>
           </w:p>
@@ -1945,7 +3206,14 @@
             <w:tcW w:type="dxa" w:w="2412"/>
           </w:tcPr>
           <w:p>
+            <w:pPr>
+              <w:spacing w:line="240" w:lineRule="auto" w:after="40"/>
+            </w:pPr>
             <w:r>
+              <w:rPr>
+                <w:rFonts w:ascii="Times New Roman" w:hAnsi="Times New Roman"/>
+                <w:sz w:val="18"/>
+              </w:rPr>
               <w:t>Niigata</w:t>
             </w:r>
           </w:p>
@@ -1955,7 +3223,14 @@
             <w:tcW w:type="dxa" w:w="2412"/>
           </w:tcPr>
           <w:p>
+            <w:pPr>
+              <w:spacing w:line="240" w:lineRule="auto" w:after="40"/>
+            </w:pPr>
             <w:r>
+              <w:rPr>
+                <w:rFonts w:ascii="Times New Roman" w:hAnsi="Times New Roman"/>
+                <w:sz w:val="18"/>
+              </w:rPr>
               <w:t>Tainai</w:t>
             </w:r>
           </w:p>
@@ -1965,7 +3240,14 @@
             <w:tcW w:type="dxa" w:w="2412"/>
           </w:tcPr>
           <w:p>
+            <w:pPr>
+              <w:spacing w:line="240" w:lineRule="auto" w:after="40"/>
+            </w:pPr>
             <w:r>
+              <w:rPr>
+                <w:rFonts w:ascii="Times New Roman" w:hAnsi="Times New Roman"/>
+                <w:sz w:val="18"/>
+              </w:rPr>
               <w:t>Population missing in at least one year 2005-2019</w:t>
             </w:r>
           </w:p>
@@ -1975,7 +3257,14 @@
             <w:tcW w:type="dxa" w:w="2412"/>
           </w:tcPr>
           <w:p>
+            <w:pPr>
+              <w:spacing w:line="240" w:lineRule="auto" w:after="40"/>
+            </w:pPr>
             <w:r>
+              <w:rPr>
+                <w:rFonts w:ascii="Times New Roman" w:hAnsi="Times New Roman"/>
+                <w:sz w:val="18"/>
+              </w:rPr>
               <w:t>2005</w:t>
             </w:r>
           </w:p>
@@ -1987,7 +3276,14 @@
             <w:tcW w:type="dxa" w:w="2412"/>
           </w:tcPr>
           <w:p>
+            <w:pPr>
+              <w:spacing w:line="240" w:lineRule="auto" w:after="40"/>
+            </w:pPr>
             <w:r>
+              <w:rPr>
+                <w:rFonts w:ascii="Times New Roman" w:hAnsi="Times New Roman"/>
+                <w:sz w:val="18"/>
+              </w:rPr>
               <w:t>Niigata</w:t>
             </w:r>
           </w:p>
@@ -1997,7 +3293,14 @@
             <w:tcW w:type="dxa" w:w="2412"/>
           </w:tcPr>
           <w:p>
+            <w:pPr>
+              <w:spacing w:line="240" w:lineRule="auto" w:after="40"/>
+            </w:pPr>
             <w:r>
+              <w:rPr>
+                <w:rFonts w:ascii="Times New Roman" w:hAnsi="Times New Roman"/>
+                <w:sz w:val="18"/>
+              </w:rPr>
               <w:t>Seiro</w:t>
             </w:r>
           </w:p>
@@ -2007,7 +3310,14 @@
             <w:tcW w:type="dxa" w:w="2412"/>
           </w:tcPr>
           <w:p>
+            <w:pPr>
+              <w:spacing w:line="240" w:lineRule="auto" w:after="40"/>
+            </w:pPr>
             <w:r>
+              <w:rPr>
+                <w:rFonts w:ascii="Times New Roman" w:hAnsi="Times New Roman"/>
+                <w:sz w:val="18"/>
+              </w:rPr>
               <w:t>Population missing in at least one year 2005-2019</w:t>
             </w:r>
           </w:p>
@@ -2017,7 +3327,14 @@
             <w:tcW w:type="dxa" w:w="2412"/>
           </w:tcPr>
           <w:p>
+            <w:pPr>
+              <w:spacing w:line="240" w:lineRule="auto" w:after="40"/>
+            </w:pPr>
             <w:r>
+              <w:rPr>
+                <w:rFonts w:ascii="Times New Roman" w:hAnsi="Times New Roman"/>
+                <w:sz w:val="18"/>
+              </w:rPr>
               <w:t>2006</w:t>
             </w:r>
           </w:p>
@@ -2029,7 +3346,14 @@
             <w:tcW w:type="dxa" w:w="2412"/>
           </w:tcPr>
           <w:p>
+            <w:pPr>
+              <w:spacing w:line="240" w:lineRule="auto" w:after="40"/>
+            </w:pPr>
             <w:r>
+              <w:rPr>
+                <w:rFonts w:ascii="Times New Roman" w:hAnsi="Times New Roman"/>
+                <w:sz w:val="18"/>
+              </w:rPr>
               <w:t>Niigata</w:t>
             </w:r>
           </w:p>
@@ -2039,7 +3363,14 @@
             <w:tcW w:type="dxa" w:w="2412"/>
           </w:tcPr>
           <w:p>
+            <w:pPr>
+              <w:spacing w:line="240" w:lineRule="auto" w:after="40"/>
+            </w:pPr>
             <w:r>
+              <w:rPr>
+                <w:rFonts w:ascii="Times New Roman" w:hAnsi="Times New Roman"/>
+                <w:sz w:val="18"/>
+              </w:rPr>
               <w:t>Aga</w:t>
             </w:r>
           </w:p>
@@ -2049,7 +3380,14 @@
             <w:tcW w:type="dxa" w:w="2412"/>
           </w:tcPr>
           <w:p>
+            <w:pPr>
+              <w:spacing w:line="240" w:lineRule="auto" w:after="40"/>
+            </w:pPr>
             <w:r>
+              <w:rPr>
+                <w:rFonts w:ascii="Times New Roman" w:hAnsi="Times New Roman"/>
+                <w:sz w:val="18"/>
+              </w:rPr>
               <w:t>Population missing in at least one year 2005-2019</w:t>
             </w:r>
           </w:p>
@@ -2059,7 +3397,14 @@
             <w:tcW w:type="dxa" w:w="2412"/>
           </w:tcPr>
           <w:p>
+            <w:pPr>
+              <w:spacing w:line="240" w:lineRule="auto" w:after="40"/>
+            </w:pPr>
             <w:r>
+              <w:rPr>
+                <w:rFonts w:ascii="Times New Roman" w:hAnsi="Times New Roman"/>
+                <w:sz w:val="18"/>
+              </w:rPr>
               <w:t>2005</w:t>
             </w:r>
           </w:p>
@@ -2077,6 +3422,7 @@
     <w:tbl>
       <w:tblPr>
         <w:tblW w:type="auto" w:w="0"/>
+        <w:tblLayout w:type="fixed"/>
         <w:tblLook w:firstColumn="1" w:firstRow="1" w:lastColumn="0" w:lastRow="0" w:noHBand="0" w:noVBand="1" w:val="04A0"/>
         <w:tblBorders>
           <w:top w:val="single" w:sz="8"/>
@@ -2104,7 +3450,14 @@
             </w:tcBorders>
           </w:tcPr>
           <w:p>
+            <w:pPr>
+              <w:spacing w:line="240" w:lineRule="auto" w:after="40"/>
+            </w:pPr>
             <w:r>
+              <w:rPr>
+                <w:rFonts w:ascii="Times New Roman" w:hAnsi="Times New Roman"/>
+                <w:sz w:val="18"/>
+              </w:rPr>
               <w:t>Municipality</w:t>
             </w:r>
           </w:p>
@@ -2117,7 +3470,14 @@
             </w:tcBorders>
           </w:tcPr>
           <w:p>
+            <w:pPr>
+              <w:spacing w:line="240" w:lineRule="auto" w:after="40"/>
+            </w:pPr>
             <w:r>
+              <w:rPr>
+                <w:rFonts w:ascii="Times New Roman" w:hAnsi="Times New Roman"/>
+                <w:sz w:val="18"/>
+              </w:rPr>
               <w:t>Donors</w:t>
             </w:r>
           </w:p>
@@ -2130,7 +3490,14 @@
             </w:tcBorders>
           </w:tcPr>
           <w:p>
+            <w:pPr>
+              <w:spacing w:line="240" w:lineRule="auto" w:after="40"/>
+            </w:pPr>
             <w:r>
+              <w:rPr>
+                <w:rFonts w:ascii="Times New Roman" w:hAnsi="Times New Roman"/>
+                <w:sz w:val="18"/>
+              </w:rPr>
               <w:t>Pre-RMSPE</w:t>
             </w:r>
           </w:p>
@@ -2143,7 +3510,14 @@
             </w:tcBorders>
           </w:tcPr>
           <w:p>
+            <w:pPr>
+              <w:spacing w:line="240" w:lineRule="auto" w:after="40"/>
+            </w:pPr>
             <w:r>
+              <w:rPr>
+                <w:rFonts w:ascii="Times New Roman" w:hAnsi="Times New Roman"/>
+                <w:sz w:val="18"/>
+              </w:rPr>
               <w:t>Post-RMSPE</w:t>
             </w:r>
           </w:p>
@@ -2156,7 +3530,14 @@
             </w:tcBorders>
           </w:tcPr>
           <w:p>
+            <w:pPr>
+              <w:spacing w:line="240" w:lineRule="auto" w:after="40"/>
+            </w:pPr>
             <w:r>
+              <w:rPr>
+                <w:rFonts w:ascii="Times New Roman" w:hAnsi="Times New Roman"/>
+                <w:sz w:val="18"/>
+              </w:rPr>
               <w:t>Mean gap 2012-2019</w:t>
             </w:r>
           </w:p>
@@ -2169,7 +3550,14 @@
             </w:tcBorders>
           </w:tcPr>
           <w:p>
+            <w:pPr>
+              <w:spacing w:line="240" w:lineRule="auto" w:after="40"/>
+            </w:pPr>
             <w:r>
+              <w:rPr>
+                <w:rFonts w:ascii="Times New Roman" w:hAnsi="Times New Roman"/>
+                <w:sz w:val="18"/>
+              </w:rPr>
               <w:t>Permutation p</w:t>
             </w:r>
           </w:p>
@@ -2181,7 +3569,14 @@
             <w:tcW w:type="dxa" w:w="1608"/>
           </w:tcPr>
           <w:p>
+            <w:pPr>
+              <w:spacing w:line="240" w:lineRule="auto" w:after="40"/>
+            </w:pPr>
             <w:r>
+              <w:rPr>
+                <w:rFonts w:ascii="Times New Roman" w:hAnsi="Times New Roman"/>
+                <w:sz w:val="18"/>
+              </w:rPr>
               <w:t>Minamisoma</w:t>
             </w:r>
           </w:p>
@@ -2191,7 +3586,14 @@
             <w:tcW w:type="dxa" w:w="1608"/>
           </w:tcPr>
           <w:p>
+            <w:pPr>
+              <w:spacing w:line="240" w:lineRule="auto" w:after="40"/>
+            </w:pPr>
             <w:r>
+              <w:rPr>
+                <w:rFonts w:ascii="Times New Roman" w:hAnsi="Times New Roman"/>
+                <w:sz w:val="18"/>
+              </w:rPr>
               <w:t>7</w:t>
             </w:r>
           </w:p>
@@ -2201,8 +3603,15 @@
             <w:tcW w:type="dxa" w:w="1608"/>
           </w:tcPr>
           <w:p>
+            <w:pPr>
+              <w:spacing w:line="240" w:lineRule="auto" w:after="40"/>
+            </w:pPr>
             <w:r>
-              <w:t>0.0293004359789378</w:t>
+              <w:rPr>
+                <w:rFonts w:ascii="Times New Roman" w:hAnsi="Times New Roman"/>
+                <w:sz w:val="18"/>
+              </w:rPr>
+              <w:t>0.029</w:t>
             </w:r>
           </w:p>
         </w:tc>
@@ -2211,8 +3620,15 @@
             <w:tcW w:type="dxa" w:w="1608"/>
           </w:tcPr>
           <w:p>
+            <w:pPr>
+              <w:spacing w:line="240" w:lineRule="auto" w:after="40"/>
+            </w:pPr>
             <w:r>
-              <w:t>0.1839369029359153</w:t>
+              <w:rPr>
+                <w:rFonts w:ascii="Times New Roman" w:hAnsi="Times New Roman"/>
+                <w:sz w:val="18"/>
+              </w:rPr>
+              <w:t>0.184</w:t>
             </w:r>
           </w:p>
         </w:tc>
@@ -2221,8 +3637,15 @@
             <w:tcW w:type="dxa" w:w="1608"/>
           </w:tcPr>
           <w:p>
+            <w:pPr>
+              <w:spacing w:line="240" w:lineRule="auto" w:after="40"/>
+            </w:pPr>
             <w:r>
-              <w:t>-0.0106632202853943</w:t>
+              <w:rPr>
+                <w:rFonts w:ascii="Times New Roman" w:hAnsi="Times New Roman"/>
+                <w:sz w:val="18"/>
+              </w:rPr>
+              <w:t>-0.011</w:t>
             </w:r>
           </w:p>
         </w:tc>
@@ -2231,7 +3654,14 @@
             <w:tcW w:type="dxa" w:w="1608"/>
           </w:tcPr>
           <w:p>
+            <w:pPr>
+              <w:spacing w:line="240" w:lineRule="auto" w:after="40"/>
+            </w:pPr>
             <w:r>
+              <w:rPr>
+                <w:rFonts w:ascii="Times New Roman" w:hAnsi="Times New Roman"/>
+                <w:sz w:val="18"/>
+              </w:rPr>
               <w:t>0.25</w:t>
             </w:r>
           </w:p>
@@ -2243,7 +3673,14 @@
             <w:tcW w:type="dxa" w:w="1608"/>
           </w:tcPr>
           <w:p>
+            <w:pPr>
+              <w:spacing w:line="240" w:lineRule="auto" w:after="40"/>
+            </w:pPr>
             <w:r>
+              <w:rPr>
+                <w:rFonts w:ascii="Times New Roman" w:hAnsi="Times New Roman"/>
+                <w:sz w:val="18"/>
+              </w:rPr>
               <w:t>Kawamata</w:t>
             </w:r>
           </w:p>
@@ -2253,7 +3690,14 @@
             <w:tcW w:type="dxa" w:w="1608"/>
           </w:tcPr>
           <w:p>
+            <w:pPr>
+              <w:spacing w:line="240" w:lineRule="auto" w:after="40"/>
+            </w:pPr>
             <w:r>
+              <w:rPr>
+                <w:rFonts w:ascii="Times New Roman" w:hAnsi="Times New Roman"/>
+                <w:sz w:val="18"/>
+              </w:rPr>
               <w:t>23</w:t>
             </w:r>
           </w:p>
@@ -2263,8 +3707,15 @@
             <w:tcW w:type="dxa" w:w="1608"/>
           </w:tcPr>
           <w:p>
+            <w:pPr>
+              <w:spacing w:line="240" w:lineRule="auto" w:after="40"/>
+            </w:pPr>
             <w:r>
-              <w:t>0.0097976486915868</w:t>
+              <w:rPr>
+                <w:rFonts w:ascii="Times New Roman" w:hAnsi="Times New Roman"/>
+                <w:sz w:val="18"/>
+              </w:rPr>
+              <w:t>0.01</w:t>
             </w:r>
           </w:p>
         </w:tc>
@@ -2273,8 +3724,15 @@
             <w:tcW w:type="dxa" w:w="1608"/>
           </w:tcPr>
           <w:p>
+            <w:pPr>
+              <w:spacing w:line="240" w:lineRule="auto" w:after="40"/>
+            </w:pPr>
             <w:r>
-              <w:t>0.0816468760361608</w:t>
+              <w:rPr>
+                <w:rFonts w:ascii="Times New Roman" w:hAnsi="Times New Roman"/>
+                <w:sz w:val="18"/>
+              </w:rPr>
+              <w:t>0.082</w:t>
             </w:r>
           </w:p>
         </w:tc>
@@ -2283,8 +3741,15 @@
             <w:tcW w:type="dxa" w:w="1608"/>
           </w:tcPr>
           <w:p>
+            <w:pPr>
+              <w:spacing w:line="240" w:lineRule="auto" w:after="40"/>
+            </w:pPr>
             <w:r>
-              <w:t>0.0551197222469218</w:t>
+              <w:rPr>
+                <w:rFonts w:ascii="Times New Roman" w:hAnsi="Times New Roman"/>
+                <w:sz w:val="18"/>
+              </w:rPr>
+              <w:t>0.055</w:t>
             </w:r>
           </w:p>
         </w:tc>
@@ -2293,8 +3758,15 @@
             <w:tcW w:type="dxa" w:w="1608"/>
           </w:tcPr>
           <w:p>
+            <w:pPr>
+              <w:spacing w:line="240" w:lineRule="auto" w:after="40"/>
+            </w:pPr>
             <w:r>
-              <w:t>0.3333333333333333</w:t>
+              <w:rPr>
+                <w:rFonts w:ascii="Times New Roman" w:hAnsi="Times New Roman"/>
+                <w:sz w:val="18"/>
+              </w:rPr>
+              <w:t>0.333</w:t>
             </w:r>
           </w:p>
         </w:tc>
@@ -2305,7 +3777,14 @@
             <w:tcW w:type="dxa" w:w="1608"/>
           </w:tcPr>
           <w:p>
+            <w:pPr>
+              <w:spacing w:line="240" w:lineRule="auto" w:after="40"/>
+            </w:pPr>
             <w:r>
+              <w:rPr>
+                <w:rFonts w:ascii="Times New Roman" w:hAnsi="Times New Roman"/>
+                <w:sz w:val="18"/>
+              </w:rPr>
               <w:t>Naraha</w:t>
             </w:r>
           </w:p>
@@ -2315,7 +3794,14 @@
             <w:tcW w:type="dxa" w:w="1608"/>
           </w:tcPr>
           <w:p>
+            <w:pPr>
+              <w:spacing w:line="240" w:lineRule="auto" w:after="40"/>
+            </w:pPr>
             <w:r>
+              <w:rPr>
+                <w:rFonts w:ascii="Times New Roman" w:hAnsi="Times New Roman"/>
+                <w:sz w:val="18"/>
+              </w:rPr>
               <w:t>20</w:t>
             </w:r>
           </w:p>
@@ -2325,8 +3811,15 @@
             <w:tcW w:type="dxa" w:w="1608"/>
           </w:tcPr>
           <w:p>
+            <w:pPr>
+              <w:spacing w:line="240" w:lineRule="auto" w:after="40"/>
+            </w:pPr>
             <w:r>
-              <w:t>0.0884818531208004</w:t>
+              <w:rPr>
+                <w:rFonts w:ascii="Times New Roman" w:hAnsi="Times New Roman"/>
+                <w:sz w:val="18"/>
+              </w:rPr>
+              <w:t>0.088</w:t>
             </w:r>
           </w:p>
         </w:tc>
@@ -2335,8 +3828,15 @@
             <w:tcW w:type="dxa" w:w="1608"/>
           </w:tcPr>
           <w:p>
+            <w:pPr>
+              <w:spacing w:line="240" w:lineRule="auto" w:after="40"/>
+            </w:pPr>
             <w:r>
-              <w:t>0.2043826907729224</w:t>
+              <w:rPr>
+                <w:rFonts w:ascii="Times New Roman" w:hAnsi="Times New Roman"/>
+                <w:sz w:val="18"/>
+              </w:rPr>
+              <w:t>0.204</w:t>
             </w:r>
           </w:p>
         </w:tc>
@@ -2345,8 +3845,15 @@
             <w:tcW w:type="dxa" w:w="1608"/>
           </w:tcPr>
           <w:p>
+            <w:pPr>
+              <w:spacing w:line="240" w:lineRule="auto" w:after="40"/>
+            </w:pPr>
             <w:r>
-              <w:t>-0.1279509738692234</w:t>
+              <w:rPr>
+                <w:rFonts w:ascii="Times New Roman" w:hAnsi="Times New Roman"/>
+                <w:sz w:val="18"/>
+              </w:rPr>
+              <w:t>-0.128</w:t>
             </w:r>
           </w:p>
         </w:tc>
@@ -2355,8 +3862,15 @@
             <w:tcW w:type="dxa" w:w="1608"/>
           </w:tcPr>
           <w:p>
+            <w:pPr>
+              <w:spacing w:line="240" w:lineRule="auto" w:after="40"/>
+            </w:pPr>
             <w:r>
-              <w:t>0.7142857142857143</w:t>
+              <w:rPr>
+                <w:rFonts w:ascii="Times New Roman" w:hAnsi="Times New Roman"/>
+                <w:sz w:val="18"/>
+              </w:rPr>
+              <w:t>0.714</w:t>
             </w:r>
           </w:p>
         </w:tc>
@@ -2367,7 +3881,14 @@
             <w:tcW w:type="dxa" w:w="1608"/>
           </w:tcPr>
           <w:p>
+            <w:pPr>
+              <w:spacing w:line="240" w:lineRule="auto" w:after="40"/>
+            </w:pPr>
             <w:r>
+              <w:rPr>
+                <w:rFonts w:ascii="Times New Roman" w:hAnsi="Times New Roman"/>
+                <w:sz w:val="18"/>
+              </w:rPr>
               <w:t>Tomioka</w:t>
             </w:r>
           </w:p>
@@ -2377,7 +3898,14 @@
             <w:tcW w:type="dxa" w:w="1608"/>
           </w:tcPr>
           <w:p>
+            <w:pPr>
+              <w:spacing w:line="240" w:lineRule="auto" w:after="40"/>
+            </w:pPr>
             <w:r>
+              <w:rPr>
+                <w:rFonts w:ascii="Times New Roman" w:hAnsi="Times New Roman"/>
+                <w:sz w:val="18"/>
+              </w:rPr>
               <w:t>13</w:t>
             </w:r>
           </w:p>
@@ -2387,8 +3915,15 @@
             <w:tcW w:type="dxa" w:w="1608"/>
           </w:tcPr>
           <w:p>
+            <w:pPr>
+              <w:spacing w:line="240" w:lineRule="auto" w:after="40"/>
+            </w:pPr>
             <w:r>
-              <w:t>0.0593407198568021</w:t>
+              <w:rPr>
+                <w:rFonts w:ascii="Times New Roman" w:hAnsi="Times New Roman"/>
+                <w:sz w:val="18"/>
+              </w:rPr>
+              <w:t>0.059</w:t>
             </w:r>
           </w:p>
         </w:tc>
@@ -2397,8 +3932,15 @@
             <w:tcW w:type="dxa" w:w="1608"/>
           </w:tcPr>
           <w:p>
+            <w:pPr>
+              <w:spacing w:line="240" w:lineRule="auto" w:after="40"/>
+            </w:pPr>
             <w:r>
-              <w:t>0.1644916020423305</w:t>
+              <w:rPr>
+                <w:rFonts w:ascii="Times New Roman" w:hAnsi="Times New Roman"/>
+                <w:sz w:val="18"/>
+              </w:rPr>
+              <w:t>0.164</w:t>
             </w:r>
           </w:p>
         </w:tc>
@@ -2407,8 +3949,15 @@
             <w:tcW w:type="dxa" w:w="1608"/>
           </w:tcPr>
           <w:p>
+            <w:pPr>
+              <w:spacing w:line="240" w:lineRule="auto" w:after="40"/>
+            </w:pPr>
             <w:r>
-              <w:t>-0.1516691449521056</w:t>
+              <w:rPr>
+                <w:rFonts w:ascii="Times New Roman" w:hAnsi="Times New Roman"/>
+                <w:sz w:val="18"/>
+              </w:rPr>
+              <w:t>-0.152</w:t>
             </w:r>
           </w:p>
         </w:tc>
@@ -2417,7 +3966,14 @@
             <w:tcW w:type="dxa" w:w="1608"/>
           </w:tcPr>
           <w:p>
+            <w:pPr>
+              <w:spacing w:line="240" w:lineRule="auto" w:after="40"/>
+            </w:pPr>
             <w:r>
+              <w:rPr>
+                <w:rFonts w:ascii="Times New Roman" w:hAnsi="Times New Roman"/>
+                <w:sz w:val="18"/>
+              </w:rPr>
               <w:t>0.5</w:t>
             </w:r>
           </w:p>
@@ -2429,7 +3985,14 @@
             <w:tcW w:type="dxa" w:w="1608"/>
           </w:tcPr>
           <w:p>
+            <w:pPr>
+              <w:spacing w:line="240" w:lineRule="auto" w:after="40"/>
+            </w:pPr>
             <w:r>
+              <w:rPr>
+                <w:rFonts w:ascii="Times New Roman" w:hAnsi="Times New Roman"/>
+                <w:sz w:val="18"/>
+              </w:rPr>
               <w:t>Kawauchi</w:t>
             </w:r>
           </w:p>
@@ -2439,7 +4002,14 @@
             <w:tcW w:type="dxa" w:w="1608"/>
           </w:tcPr>
           <w:p>
+            <w:pPr>
+              <w:spacing w:line="240" w:lineRule="auto" w:after="40"/>
+            </w:pPr>
             <w:r>
+              <w:rPr>
+                <w:rFonts w:ascii="Times New Roman" w:hAnsi="Times New Roman"/>
+                <w:sz w:val="18"/>
+              </w:rPr>
               <w:t>13</w:t>
             </w:r>
           </w:p>
@@ -2449,8 +4019,15 @@
             <w:tcW w:type="dxa" w:w="1608"/>
           </w:tcPr>
           <w:p>
+            <w:pPr>
+              <w:spacing w:line="240" w:lineRule="auto" w:after="40"/>
+            </w:pPr>
             <w:r>
-              <w:t>0.0444060903046119</w:t>
+              <w:rPr>
+                <w:rFonts w:ascii="Times New Roman" w:hAnsi="Times New Roman"/>
+                <w:sz w:val="18"/>
+              </w:rPr>
+              <w:t>0.044</w:t>
             </w:r>
           </w:p>
         </w:tc>
@@ -2459,8 +4036,15 @@
             <w:tcW w:type="dxa" w:w="1608"/>
           </w:tcPr>
           <w:p>
+            <w:pPr>
+              <w:spacing w:line="240" w:lineRule="auto" w:after="40"/>
+            </w:pPr>
             <w:r>
-              <w:t>0.148073524583365</w:t>
+              <w:rPr>
+                <w:rFonts w:ascii="Times New Roman" w:hAnsi="Times New Roman"/>
+                <w:sz w:val="18"/>
+              </w:rPr>
+              <w:t>0.148</w:t>
             </w:r>
           </w:p>
         </w:tc>
@@ -2469,8 +4053,15 @@
             <w:tcW w:type="dxa" w:w="1608"/>
           </w:tcPr>
           <w:p>
+            <w:pPr>
+              <w:spacing w:line="240" w:lineRule="auto" w:after="40"/>
+            </w:pPr>
             <w:r>
-              <w:t>0.0831437141637636</w:t>
+              <w:rPr>
+                <w:rFonts w:ascii="Times New Roman" w:hAnsi="Times New Roman"/>
+                <w:sz w:val="18"/>
+              </w:rPr>
+              <w:t>0.083</w:t>
             </w:r>
           </w:p>
         </w:tc>
@@ -2479,7 +4070,14 @@
             <w:tcW w:type="dxa" w:w="1608"/>
           </w:tcPr>
           <w:p>
+            <w:pPr>
+              <w:spacing w:line="240" w:lineRule="auto" w:after="40"/>
+            </w:pPr>
             <w:r>
+              <w:rPr>
+                <w:rFonts w:ascii="Times New Roman" w:hAnsi="Times New Roman"/>
+                <w:sz w:val="18"/>
+              </w:rPr>
               <w:t>0.5</w:t>
             </w:r>
           </w:p>
@@ -2491,7 +4089,14 @@
             <w:tcW w:type="dxa" w:w="1608"/>
           </w:tcPr>
           <w:p>
+            <w:pPr>
+              <w:spacing w:line="240" w:lineRule="auto" w:after="40"/>
+            </w:pPr>
             <w:r>
+              <w:rPr>
+                <w:rFonts w:ascii="Times New Roman" w:hAnsi="Times New Roman"/>
+                <w:sz w:val="18"/>
+              </w:rPr>
               <w:t>Okuma</w:t>
             </w:r>
           </w:p>
@@ -2501,7 +4106,14 @@
             <w:tcW w:type="dxa" w:w="1608"/>
           </w:tcPr>
           <w:p>
+            <w:pPr>
+              <w:spacing w:line="240" w:lineRule="auto" w:after="40"/>
+            </w:pPr>
             <w:r>
+              <w:rPr>
+                <w:rFonts w:ascii="Times New Roman" w:hAnsi="Times New Roman"/>
+                <w:sz w:val="18"/>
+              </w:rPr>
               <w:t>15</w:t>
             </w:r>
           </w:p>
@@ -2511,8 +4123,15 @@
             <w:tcW w:type="dxa" w:w="1608"/>
           </w:tcPr>
           <w:p>
+            <w:pPr>
+              <w:spacing w:line="240" w:lineRule="auto" w:after="40"/>
+            </w:pPr>
             <w:r>
-              <w:t>0.1444174894492124</w:t>
+              <w:rPr>
+                <w:rFonts w:ascii="Times New Roman" w:hAnsi="Times New Roman"/>
+                <w:sz w:val="18"/>
+              </w:rPr>
+              <w:t>0.144</w:t>
             </w:r>
           </w:p>
         </w:tc>
@@ -2521,8 +4140,15 @@
             <w:tcW w:type="dxa" w:w="1608"/>
           </w:tcPr>
           <w:p>
+            <w:pPr>
+              <w:spacing w:line="240" w:lineRule="auto" w:after="40"/>
+            </w:pPr>
             <w:r>
-              <w:t>0.3036511289006508</w:t>
+              <w:rPr>
+                <w:rFonts w:ascii="Times New Roman" w:hAnsi="Times New Roman"/>
+                <w:sz w:val="18"/>
+              </w:rPr>
+              <w:t>0.304</w:t>
             </w:r>
           </w:p>
         </w:tc>
@@ -2531,8 +4157,15 @@
             <w:tcW w:type="dxa" w:w="1608"/>
           </w:tcPr>
           <w:p>
+            <w:pPr>
+              <w:spacing w:line="240" w:lineRule="auto" w:after="40"/>
+            </w:pPr>
             <w:r>
-              <w:t>-0.2680255705173741</w:t>
+              <w:rPr>
+                <w:rFonts w:ascii="Times New Roman" w:hAnsi="Times New Roman"/>
+                <w:sz w:val="18"/>
+              </w:rPr>
+              <w:t>-0.268</w:t>
             </w:r>
           </w:p>
         </w:tc>
@@ -2541,8 +4174,15 @@
             <w:tcW w:type="dxa" w:w="1608"/>
           </w:tcPr>
           <w:p>
+            <w:pPr>
+              <w:spacing w:line="240" w:lineRule="auto" w:after="40"/>
+            </w:pPr>
             <w:r>
-              <w:t>0.5625</w:t>
+              <w:rPr>
+                <w:rFonts w:ascii="Times New Roman" w:hAnsi="Times New Roman"/>
+                <w:sz w:val="18"/>
+              </w:rPr>
+              <w:t>0.562</w:t>
             </w:r>
           </w:p>
         </w:tc>
@@ -2553,7 +4193,14 @@
             <w:tcW w:type="dxa" w:w="1608"/>
           </w:tcPr>
           <w:p>
+            <w:pPr>
+              <w:spacing w:line="240" w:lineRule="auto" w:after="40"/>
+            </w:pPr>
             <w:r>
+              <w:rPr>
+                <w:rFonts w:ascii="Times New Roman" w:hAnsi="Times New Roman"/>
+                <w:sz w:val="18"/>
+              </w:rPr>
               <w:t>Futaba</w:t>
             </w:r>
           </w:p>
@@ -2563,7 +4210,14 @@
             <w:tcW w:type="dxa" w:w="1608"/>
           </w:tcPr>
           <w:p>
+            <w:pPr>
+              <w:spacing w:line="240" w:lineRule="auto" w:after="40"/>
+            </w:pPr>
             <w:r>
+              <w:rPr>
+                <w:rFonts w:ascii="Times New Roman" w:hAnsi="Times New Roman"/>
+                <w:sz w:val="18"/>
+              </w:rPr>
               <w:t>20</w:t>
             </w:r>
           </w:p>
@@ -2573,8 +4227,15 @@
             <w:tcW w:type="dxa" w:w="1608"/>
           </w:tcPr>
           <w:p>
+            <w:pPr>
+              <w:spacing w:line="240" w:lineRule="auto" w:after="40"/>
+            </w:pPr>
             <w:r>
-              <w:t>0.0489068465462831</w:t>
+              <w:rPr>
+                <w:rFonts w:ascii="Times New Roman" w:hAnsi="Times New Roman"/>
+                <w:sz w:val="18"/>
+              </w:rPr>
+              <w:t>0.049</w:t>
             </w:r>
           </w:p>
         </w:tc>
@@ -2583,8 +4244,15 @@
             <w:tcW w:type="dxa" w:w="1608"/>
           </w:tcPr>
           <w:p>
+            <w:pPr>
+              <w:spacing w:line="240" w:lineRule="auto" w:after="40"/>
+            </w:pPr>
             <w:r>
-              <w:t>0.2571351506549926</w:t>
+              <w:rPr>
+                <w:rFonts w:ascii="Times New Roman" w:hAnsi="Times New Roman"/>
+                <w:sz w:val="18"/>
+              </w:rPr>
+              <w:t>0.257</w:t>
             </w:r>
           </w:p>
         </w:tc>
@@ -2593,8 +4261,15 @@
             <w:tcW w:type="dxa" w:w="1608"/>
           </w:tcPr>
           <w:p>
+            <w:pPr>
+              <w:spacing w:line="240" w:lineRule="auto" w:after="40"/>
+            </w:pPr>
             <w:r>
-              <w:t>-0.1909625137928648</w:t>
+              <w:rPr>
+                <w:rFonts w:ascii="Times New Roman" w:hAnsi="Times New Roman"/>
+                <w:sz w:val="18"/>
+              </w:rPr>
+              <w:t>-0.191</w:t>
             </w:r>
           </w:p>
         </w:tc>
@@ -2603,8 +4278,15 @@
             <w:tcW w:type="dxa" w:w="1608"/>
           </w:tcPr>
           <w:p>
+            <w:pPr>
+              <w:spacing w:line="240" w:lineRule="auto" w:after="40"/>
+            </w:pPr>
             <w:r>
-              <w:t>0.2857142857142857</w:t>
+              <w:rPr>
+                <w:rFonts w:ascii="Times New Roman" w:hAnsi="Times New Roman"/>
+                <w:sz w:val="18"/>
+              </w:rPr>
+              <w:t>0.286</w:t>
             </w:r>
           </w:p>
         </w:tc>
@@ -2615,7 +4297,14 @@
             <w:tcW w:type="dxa" w:w="1608"/>
           </w:tcPr>
           <w:p>
+            <w:pPr>
+              <w:spacing w:line="240" w:lineRule="auto" w:after="40"/>
+            </w:pPr>
             <w:r>
+              <w:rPr>
+                <w:rFonts w:ascii="Times New Roman" w:hAnsi="Times New Roman"/>
+                <w:sz w:val="18"/>
+              </w:rPr>
               <w:t>Namie</w:t>
             </w:r>
           </w:p>
@@ -2625,7 +4314,14 @@
             <w:tcW w:type="dxa" w:w="1608"/>
           </w:tcPr>
           <w:p>
+            <w:pPr>
+              <w:spacing w:line="240" w:lineRule="auto" w:after="40"/>
+            </w:pPr>
             <w:r>
+              <w:rPr>
+                <w:rFonts w:ascii="Times New Roman" w:hAnsi="Times New Roman"/>
+                <w:sz w:val="18"/>
+              </w:rPr>
               <w:t>18</w:t>
             </w:r>
           </w:p>
@@ -2635,8 +4331,15 @@
             <w:tcW w:type="dxa" w:w="1608"/>
           </w:tcPr>
           <w:p>
+            <w:pPr>
+              <w:spacing w:line="240" w:lineRule="auto" w:after="40"/>
+            </w:pPr>
             <w:r>
-              <w:t>0.004382533378559</w:t>
+              <w:rPr>
+                <w:rFonts w:ascii="Times New Roman" w:hAnsi="Times New Roman"/>
+                <w:sz w:val="18"/>
+              </w:rPr>
+              <w:t>0.004</w:t>
             </w:r>
           </w:p>
         </w:tc>
@@ -2645,8 +4348,15 @@
             <w:tcW w:type="dxa" w:w="1608"/>
           </w:tcPr>
           <w:p>
+            <w:pPr>
+              <w:spacing w:line="240" w:lineRule="auto" w:after="40"/>
+            </w:pPr>
             <w:r>
-              <w:t>0.1800522917924872</w:t>
+              <w:rPr>
+                <w:rFonts w:ascii="Times New Roman" w:hAnsi="Times New Roman"/>
+                <w:sz w:val="18"/>
+              </w:rPr>
+              <w:t>0.18</w:t>
             </w:r>
           </w:p>
         </w:tc>
@@ -2655,8 +4365,15 @@
             <w:tcW w:type="dxa" w:w="1608"/>
           </w:tcPr>
           <w:p>
+            <w:pPr>
+              <w:spacing w:line="240" w:lineRule="auto" w:after="40"/>
+            </w:pPr>
             <w:r>
-              <w:t>-0.098411662199711</w:t>
+              <w:rPr>
+                <w:rFonts w:ascii="Times New Roman" w:hAnsi="Times New Roman"/>
+                <w:sz w:val="18"/>
+              </w:rPr>
+              <w:t>-0.098</w:t>
             </w:r>
           </w:p>
         </w:tc>
@@ -2665,8 +4382,15 @@
             <w:tcW w:type="dxa" w:w="1608"/>
           </w:tcPr>
           <w:p>
+            <w:pPr>
+              <w:spacing w:line="240" w:lineRule="auto" w:after="40"/>
+            </w:pPr>
             <w:r>
-              <w:t>0.2631578947368421</w:t>
+              <w:rPr>
+                <w:rFonts w:ascii="Times New Roman" w:hAnsi="Times New Roman"/>
+                <w:sz w:val="18"/>
+              </w:rPr>
+              <w:t>0.263</w:t>
             </w:r>
           </w:p>
         </w:tc>
@@ -2677,7 +4401,14 @@
             <w:tcW w:type="dxa" w:w="1608"/>
           </w:tcPr>
           <w:p>
+            <w:pPr>
+              <w:spacing w:line="240" w:lineRule="auto" w:after="40"/>
+            </w:pPr>
             <w:r>
+              <w:rPr>
+                <w:rFonts w:ascii="Times New Roman" w:hAnsi="Times New Roman"/>
+                <w:sz w:val="18"/>
+              </w:rPr>
               <w:t>Katsurao</w:t>
             </w:r>
           </w:p>
@@ -2687,7 +4418,14 @@
             <w:tcW w:type="dxa" w:w="1608"/>
           </w:tcPr>
           <w:p>
+            <w:pPr>
+              <w:spacing w:line="240" w:lineRule="auto" w:after="40"/>
+            </w:pPr>
             <w:r>
+              <w:rPr>
+                <w:rFonts w:ascii="Times New Roman" w:hAnsi="Times New Roman"/>
+                <w:sz w:val="18"/>
+              </w:rPr>
               <w:t>5</w:t>
             </w:r>
           </w:p>
@@ -2697,8 +4435,15 @@
             <w:tcW w:type="dxa" w:w="1608"/>
           </w:tcPr>
           <w:p>
+            <w:pPr>
+              <w:spacing w:line="240" w:lineRule="auto" w:after="40"/>
+            </w:pPr>
             <w:r>
-              <w:t>0.1826943753700668</w:t>
+              <w:rPr>
+                <w:rFonts w:ascii="Times New Roman" w:hAnsi="Times New Roman"/>
+                <w:sz w:val="18"/>
+              </w:rPr>
+              <w:t>0.183</w:t>
             </w:r>
           </w:p>
         </w:tc>
@@ -2707,8 +4452,15 @@
             <w:tcW w:type="dxa" w:w="1608"/>
           </w:tcPr>
           <w:p>
+            <w:pPr>
+              <w:spacing w:line="240" w:lineRule="auto" w:after="40"/>
+            </w:pPr>
             <w:r>
-              <w:t>0.2488059139201824</w:t>
+              <w:rPr>
+                <w:rFonts w:ascii="Times New Roman" w:hAnsi="Times New Roman"/>
+                <w:sz w:val="18"/>
+              </w:rPr>
+              <w:t>0.249</w:t>
             </w:r>
           </w:p>
         </w:tc>
@@ -2717,8 +4469,15 @@
             <w:tcW w:type="dxa" w:w="1608"/>
           </w:tcPr>
           <w:p>
+            <w:pPr>
+              <w:spacing w:line="240" w:lineRule="auto" w:after="40"/>
+            </w:pPr>
             <w:r>
-              <w:t>-0.1367370317019828</w:t>
+              <w:rPr>
+                <w:rFonts w:ascii="Times New Roman" w:hAnsi="Times New Roman"/>
+                <w:sz w:val="18"/>
+              </w:rPr>
+              <w:t>-0.137</w:t>
             </w:r>
           </w:p>
         </w:tc>
@@ -2727,8 +4486,15 @@
             <w:tcW w:type="dxa" w:w="1608"/>
           </w:tcPr>
           <w:p>
+            <w:pPr>
+              <w:spacing w:line="240" w:lineRule="auto" w:after="40"/>
+            </w:pPr>
             <w:r>
-              <w:t>0.8333333333333334</w:t>
+              <w:rPr>
+                <w:rFonts w:ascii="Times New Roman" w:hAnsi="Times New Roman"/>
+                <w:sz w:val="18"/>
+              </w:rPr>
+              <w:t>0.833</w:t>
             </w:r>
           </w:p>
         </w:tc>
@@ -2739,7 +4505,14 @@
             <w:tcW w:type="dxa" w:w="1608"/>
           </w:tcPr>
           <w:p>
+            <w:pPr>
+              <w:spacing w:line="240" w:lineRule="auto" w:after="40"/>
+            </w:pPr>
             <w:r>
+              <w:rPr>
+                <w:rFonts w:ascii="Times New Roman" w:hAnsi="Times New Roman"/>
+                <w:sz w:val="18"/>
+              </w:rPr>
               <w:t>Iitate</w:t>
             </w:r>
           </w:p>
@@ -2749,7 +4522,14 @@
             <w:tcW w:type="dxa" w:w="1608"/>
           </w:tcPr>
           <w:p>
+            <w:pPr>
+              <w:spacing w:line="240" w:lineRule="auto" w:after="40"/>
+            </w:pPr>
             <w:r>
+              <w:rPr>
+                <w:rFonts w:ascii="Times New Roman" w:hAnsi="Times New Roman"/>
+                <w:sz w:val="18"/>
+              </w:rPr>
               <w:t>22</w:t>
             </w:r>
           </w:p>
@@ -2759,8 +4539,15 @@
             <w:tcW w:type="dxa" w:w="1608"/>
           </w:tcPr>
           <w:p>
+            <w:pPr>
+              <w:spacing w:line="240" w:lineRule="auto" w:after="40"/>
+            </w:pPr>
             <w:r>
-              <w:t>0.0168998085544957</w:t>
+              <w:rPr>
+                <w:rFonts w:ascii="Times New Roman" w:hAnsi="Times New Roman"/>
+                <w:sz w:val="18"/>
+              </w:rPr>
+              <w:t>0.017</w:t>
             </w:r>
           </w:p>
         </w:tc>
@@ -2769,8 +4556,15 @@
             <w:tcW w:type="dxa" w:w="1608"/>
           </w:tcPr>
           <w:p>
+            <w:pPr>
+              <w:spacing w:line="240" w:lineRule="auto" w:after="40"/>
+            </w:pPr>
             <w:r>
-              <w:t>0.1182144350993184</w:t>
+              <w:rPr>
+                <w:rFonts w:ascii="Times New Roman" w:hAnsi="Times New Roman"/>
+                <w:sz w:val="18"/>
+              </w:rPr>
+              <w:t>0.118</w:t>
             </w:r>
           </w:p>
         </w:tc>
@@ -2779,8 +4573,15 @@
             <w:tcW w:type="dxa" w:w="1608"/>
           </w:tcPr>
           <w:p>
+            <w:pPr>
+              <w:spacing w:line="240" w:lineRule="auto" w:after="40"/>
+            </w:pPr>
             <w:r>
-              <w:t>-0.0265778280351051</w:t>
+              <w:rPr>
+                <w:rFonts w:ascii="Times New Roman" w:hAnsi="Times New Roman"/>
+                <w:sz w:val="18"/>
+              </w:rPr>
+              <w:t>-0.027</w:t>
             </w:r>
           </w:p>
         </w:tc>
@@ -2789,8 +4590,15 @@
             <w:tcW w:type="dxa" w:w="1608"/>
           </w:tcPr>
           <w:p>
+            <w:pPr>
+              <w:spacing w:line="240" w:lineRule="auto" w:after="40"/>
+            </w:pPr>
             <w:r>
-              <w:t>0.3043478260869565</w:t>
+              <w:rPr>
+                <w:rFonts w:ascii="Times New Roman" w:hAnsi="Times New Roman"/>
+                <w:sz w:val="18"/>
+              </w:rPr>
+              <w:t>0.304</w:t>
             </w:r>
           </w:p>
         </w:tc>

</xml_diff>